<commit_message>
fix (PT theme - Deliverable templates EN):  margin correction in templates; Images updated with new colors i(Deliverable template for the final report)
</commit_message>
<xml_diff>
--- a/deliveries/cases/EN/1.docx
+++ b/deliveries/cases/EN/1.docx
@@ -4,7 +4,7 @@
   <w:body>
     <w:p>
       <w:pPr>
-        <w:ind w:left="3119" w:firstLine="0"/>
+        <w:ind w:left="0" w:right="0" w:firstLine="0"/>
         <w:jc w:val="right"/>
         <w:rPr>
           <w:rFonts w:ascii="Arial" w:cs="Arial" w:eastAsia="Arial" w:hAnsi="Arial"/>
@@ -32,12 +32,12 @@
             <wp:extent cx="1880235" cy="1381716"/>
             <wp:effectExtent b="0" l="0" r="0" t="0"/>
             <wp:wrapSquare wrapText="bothSides" distB="0" distT="0" distL="114300" distR="114300"/>
-            <wp:docPr id="3" name="image3.png"/>
+            <wp:docPr id="1" name="image2.png"/>
             <a:graphic>
               <a:graphicData uri="http://schemas.openxmlformats.org/drawingml/2006/picture">
                 <pic:pic>
                   <pic:nvPicPr>
-                    <pic:cNvPr id="0" name="image3.png"/>
+                    <pic:cNvPr id="0" name="image2.png"/>
                     <pic:cNvPicPr preferRelativeResize="0"/>
                   </pic:nvPicPr>
                   <pic:blipFill>
@@ -94,7 +94,7 @@
     </w:p>
     <w:p>
       <w:pPr>
-        <w:ind w:left="3119" w:firstLine="0"/>
+        <w:ind w:left="0" w:right="0" w:firstLine="0"/>
         <w:jc w:val="right"/>
         <w:rPr>
           <w:rFonts w:ascii="Arial" w:cs="Arial" w:eastAsia="Arial" w:hAnsi="Arial"/>
@@ -113,7 +113,7 @@
     </w:p>
     <w:p>
       <w:pPr>
-        <w:ind w:left="3119" w:firstLine="0"/>
+        <w:ind w:left="0" w:right="0" w:firstLine="0"/>
         <w:jc w:val="right"/>
         <w:rPr>
           <w:rFonts w:ascii="Arial" w:cs="Arial" w:eastAsia="Arial" w:hAnsi="Arial"/>
@@ -132,7 +132,7 @@
     </w:p>
     <w:p>
       <w:pPr>
-        <w:ind w:left="3119" w:firstLine="0"/>
+        <w:ind w:left="0" w:right="0" w:firstLine="0"/>
         <w:jc w:val="right"/>
         <w:rPr>
           <w:rFonts w:ascii="Arial" w:cs="Arial" w:eastAsia="Arial" w:hAnsi="Arial"/>
@@ -151,7 +151,7 @@
     </w:p>
     <w:p>
       <w:pPr>
-        <w:ind w:left="3119" w:firstLine="0"/>
+        <w:ind w:left="0" w:right="0" w:firstLine="0"/>
         <w:jc w:val="right"/>
         <w:rPr>
           <w:rFonts w:ascii="Arial" w:cs="Arial" w:eastAsia="Arial" w:hAnsi="Arial"/>
@@ -170,7 +170,7 @@
     </w:p>
     <w:p>
       <w:pPr>
-        <w:ind w:left="3119" w:firstLine="0"/>
+        <w:ind w:left="0" w:right="0" w:firstLine="0"/>
         <w:jc w:val="right"/>
         <w:rPr>
           <w:rFonts w:ascii="Arial" w:cs="Arial" w:eastAsia="Arial" w:hAnsi="Arial"/>
@@ -192,7 +192,7 @@
         <w:pBdr>
           <w:bottom w:color="000000" w:space="1" w:sz="4" w:val="single"/>
         </w:pBdr>
-        <w:ind w:left="5245" w:firstLine="0"/>
+        <w:ind w:left="0" w:right="0" w:firstLine="0"/>
         <w:jc w:val="right"/>
         <w:rPr>
           <w:rFonts w:ascii="Arial" w:cs="Arial" w:eastAsia="Arial" w:hAnsi="Arial"/>
@@ -218,12 +218,13 @@
     </w:p>
     <w:p>
       <w:pPr>
-        <w:rPr>
-          <w:rFonts w:ascii="Arial" w:cs="Arial" w:eastAsia="Arial" w:hAnsi="Arial"/>
-          <w:color w:val="231f20"/>
-        </w:rPr>
-      </w:pPr>
-      <w:bookmarkStart w:colFirst="0" w:colLast="0" w:name="_yd63xeg4kdy3" w:id="0"/>
+        <w:ind w:left="0" w:right="0" w:firstLine="0"/>
+        <w:rPr>
+          <w:rFonts w:ascii="Arial" w:cs="Arial" w:eastAsia="Arial" w:hAnsi="Arial"/>
+          <w:color w:val="231f20"/>
+        </w:rPr>
+      </w:pPr>
+      <w:bookmarkStart w:colFirst="0" w:colLast="0" w:name="_23432owwd8l" w:id="0"/>
       <w:bookmarkEnd w:id="0"/>
       <w:r>
         <w:rPr>
@@ -233,6 +234,7 @@
     </w:p>
     <w:p>
       <w:pPr>
+        <w:ind w:left="0" w:right="0" w:firstLine="0"/>
         <w:rPr>
           <w:rFonts w:ascii="Arial" w:cs="Arial" w:eastAsia="Arial" w:hAnsi="Arial"/>
           <w:color w:val="231f20"/>
@@ -249,6 +251,7 @@
         <w:tabs>
           <w:tab w:val="left" w:leader="none" w:pos="11340"/>
         </w:tabs>
+        <w:ind w:left="0" w:right="0" w:firstLine="0"/>
         <w:rPr>
           <w:rFonts w:ascii="Arial" w:cs="Arial" w:eastAsia="Arial" w:hAnsi="Arial"/>
           <w:color w:val="308aa1"/>
@@ -265,6 +268,7 @@
     </w:p>
     <w:p>
       <w:pPr>
+        <w:ind w:left="0" w:right="0" w:firstLine="0"/>
         <w:jc w:val="center"/>
         <w:rPr>
           <w:rFonts w:ascii="Arial" w:cs="Arial" w:eastAsia="Arial" w:hAnsi="Arial"/>
@@ -290,6 +294,7 @@
     </w:p>
     <w:p>
       <w:pPr>
+        <w:ind w:left="0" w:right="0" w:firstLine="0"/>
         <w:jc w:val="center"/>
         <w:rPr>
           <w:rFonts w:ascii="Arial" w:cs="Arial" w:eastAsia="Arial" w:hAnsi="Arial"/>
@@ -304,7 +309,7 @@
     </w:p>
     <w:p>
       <w:pPr>
-        <w:ind w:left="1560" w:right="1417" w:firstLine="0"/>
+        <w:ind w:left="0" w:right="0" w:firstLine="0"/>
         <w:jc w:val="center"/>
         <w:rPr>
           <w:rFonts w:ascii="Arial" w:cs="Arial" w:eastAsia="Arial" w:hAnsi="Arial"/>
@@ -330,7 +335,7 @@
     </w:p>
     <w:p>
       <w:pPr>
-        <w:ind w:left="1560" w:right="1417" w:firstLine="0"/>
+        <w:ind w:left="0" w:right="0" w:firstLine="0"/>
         <w:jc w:val="center"/>
         <w:rPr>
           <w:rFonts w:ascii="Arial" w:cs="Arial" w:eastAsia="Arial" w:hAnsi="Arial"/>
@@ -356,32 +361,35 @@
     </w:p>
     <w:p>
       <w:pPr>
-        <w:rPr>
-          <w:rFonts w:ascii="Arial" w:cs="Arial" w:eastAsia="Arial" w:hAnsi="Arial"/>
-          <w:color w:val="231f20"/>
-        </w:rPr>
-      </w:pPr>
-      <w:r>
-        <w:rPr>
-          <w:rtl w:val="0"/>
-        </w:rPr>
-      </w:r>
-    </w:p>
-    <w:p>
-      <w:pPr>
-        <w:rPr>
-          <w:rFonts w:ascii="Arial" w:cs="Arial" w:eastAsia="Arial" w:hAnsi="Arial"/>
-          <w:color w:val="231f20"/>
-        </w:rPr>
-      </w:pPr>
-      <w:r>
-        <w:rPr>
-          <w:rtl w:val="0"/>
-        </w:rPr>
-      </w:r>
-    </w:p>
-    <w:p>
-      <w:pPr>
+        <w:ind w:left="0" w:right="0" w:firstLine="0"/>
+        <w:rPr>
+          <w:rFonts w:ascii="Arial" w:cs="Arial" w:eastAsia="Arial" w:hAnsi="Arial"/>
+          <w:color w:val="231f20"/>
+        </w:rPr>
+      </w:pPr>
+      <w:r>
+        <w:rPr>
+          <w:rtl w:val="0"/>
+        </w:rPr>
+      </w:r>
+    </w:p>
+    <w:p>
+      <w:pPr>
+        <w:ind w:left="0" w:right="0" w:firstLine="0"/>
+        <w:rPr>
+          <w:rFonts w:ascii="Arial" w:cs="Arial" w:eastAsia="Arial" w:hAnsi="Arial"/>
+          <w:color w:val="231f20"/>
+        </w:rPr>
+      </w:pPr>
+      <w:r>
+        <w:rPr>
+          <w:rtl w:val="0"/>
+        </w:rPr>
+      </w:r>
+    </w:p>
+    <w:p>
+      <w:pPr>
+        <w:ind w:left="0" w:right="0" w:firstLine="0"/>
         <w:rPr>
           <w:rFonts w:ascii="Arial" w:cs="Arial" w:eastAsia="Arial" w:hAnsi="Arial"/>
           <w:color w:val="231f20"/>
@@ -398,6 +406,7 @@
         <w:tabs>
           <w:tab w:val="left" w:leader="none" w:pos="6115"/>
         </w:tabs>
+        <w:ind w:left="0" w:right="0" w:firstLine="0"/>
         <w:rPr>
           <w:rFonts w:ascii="Arial" w:cs="Arial" w:eastAsia="Arial" w:hAnsi="Arial"/>
           <w:color w:val="231f20"/>
@@ -414,6 +423,7 @@
         <w:tabs>
           <w:tab w:val="left" w:leader="none" w:pos="6115"/>
         </w:tabs>
+        <w:ind w:left="0" w:right="0" w:firstLine="0"/>
         <w:rPr>
           <w:rFonts w:ascii="Arial" w:cs="Arial" w:eastAsia="Arial" w:hAnsi="Arial"/>
           <w:color w:val="231f20"/>
@@ -430,58 +440,63 @@
         <w:tabs>
           <w:tab w:val="left" w:leader="none" w:pos="6115"/>
         </w:tabs>
-        <w:rPr>
-          <w:rFonts w:ascii="Arial" w:cs="Arial" w:eastAsia="Arial" w:hAnsi="Arial"/>
-          <w:color w:val="231f20"/>
-        </w:rPr>
-      </w:pPr>
-      <w:r>
-        <w:rPr>
-          <w:rtl w:val="0"/>
-        </w:rPr>
-      </w:r>
-    </w:p>
-    <w:p>
-      <w:pPr>
-        <w:rPr>
-          <w:rFonts w:ascii="Arial" w:cs="Arial" w:eastAsia="Arial" w:hAnsi="Arial"/>
-          <w:color w:val="231f20"/>
-        </w:rPr>
-      </w:pPr>
-      <w:r>
-        <w:rPr>
-          <w:rtl w:val="0"/>
-        </w:rPr>
-      </w:r>
-    </w:p>
-    <w:p>
-      <w:pPr>
-        <w:rPr>
-          <w:rFonts w:ascii="Arial" w:cs="Arial" w:eastAsia="Arial" w:hAnsi="Arial"/>
-          <w:color w:val="231f20"/>
-        </w:rPr>
-      </w:pPr>
-      <w:r>
-        <w:rPr>
-          <w:rtl w:val="0"/>
-        </w:rPr>
-      </w:r>
-    </w:p>
-    <w:p>
-      <w:pPr>
-        <w:rPr>
-          <w:rFonts w:ascii="Arial" w:cs="Arial" w:eastAsia="Arial" w:hAnsi="Arial"/>
-          <w:color w:val="231f20"/>
-        </w:rPr>
-      </w:pPr>
-      <w:r>
-        <w:rPr>
-          <w:rtl w:val="0"/>
-        </w:rPr>
-      </w:r>
-    </w:p>
-    <w:p>
-      <w:pPr>
+        <w:ind w:left="0" w:right="0" w:firstLine="0"/>
+        <w:rPr>
+          <w:rFonts w:ascii="Arial" w:cs="Arial" w:eastAsia="Arial" w:hAnsi="Arial"/>
+          <w:color w:val="231f20"/>
+        </w:rPr>
+      </w:pPr>
+      <w:r>
+        <w:rPr>
+          <w:rtl w:val="0"/>
+        </w:rPr>
+      </w:r>
+    </w:p>
+    <w:p>
+      <w:pPr>
+        <w:ind w:left="0" w:right="0" w:firstLine="0"/>
+        <w:rPr>
+          <w:rFonts w:ascii="Arial" w:cs="Arial" w:eastAsia="Arial" w:hAnsi="Arial"/>
+          <w:color w:val="231f20"/>
+        </w:rPr>
+      </w:pPr>
+      <w:r>
+        <w:rPr>
+          <w:rtl w:val="0"/>
+        </w:rPr>
+      </w:r>
+    </w:p>
+    <w:p>
+      <w:pPr>
+        <w:ind w:left="0" w:right="0" w:firstLine="0"/>
+        <w:rPr>
+          <w:rFonts w:ascii="Arial" w:cs="Arial" w:eastAsia="Arial" w:hAnsi="Arial"/>
+          <w:color w:val="231f20"/>
+        </w:rPr>
+      </w:pPr>
+      <w:r>
+        <w:rPr>
+          <w:rtl w:val="0"/>
+        </w:rPr>
+      </w:r>
+    </w:p>
+    <w:p>
+      <w:pPr>
+        <w:ind w:left="0" w:right="0" w:firstLine="0"/>
+        <w:rPr>
+          <w:rFonts w:ascii="Arial" w:cs="Arial" w:eastAsia="Arial" w:hAnsi="Arial"/>
+          <w:color w:val="231f20"/>
+        </w:rPr>
+      </w:pPr>
+      <w:r>
+        <w:rPr>
+          <w:rtl w:val="0"/>
+        </w:rPr>
+      </w:r>
+    </w:p>
+    <w:p>
+      <w:pPr>
+        <w:ind w:left="0" w:right="0" w:firstLine="0"/>
         <w:rPr>
           <w:rFonts w:ascii="Arial" w:cs="Arial" w:eastAsia="Arial" w:hAnsi="Arial"/>
           <w:b w:val="1"/>
@@ -518,6 +533,7 @@
           <w:tab w:val="left" w:leader="none" w:pos="2835"/>
         </w:tabs>
         <w:spacing w:after="0" w:lineRule="auto"/>
+        <w:ind w:left="0" w:right="0" w:firstLine="0"/>
         <w:rPr>
           <w:rFonts w:ascii="Arial" w:cs="Arial" w:eastAsia="Arial" w:hAnsi="Arial"/>
           <w:color w:val="231f20"/>
@@ -552,6 +568,7 @@
           <w:tab w:val="left" w:leader="none" w:pos="2835"/>
         </w:tabs>
         <w:spacing w:after="0" w:lineRule="auto"/>
+        <w:ind w:left="0" w:right="0" w:firstLine="0"/>
         <w:rPr>
           <w:rFonts w:ascii="Arial" w:cs="Arial" w:eastAsia="Arial" w:hAnsi="Arial"/>
           <w:color w:val="231f20"/>
@@ -586,6 +603,7 @@
           <w:tab w:val="left" w:leader="none" w:pos="2835"/>
         </w:tabs>
         <w:spacing w:after="0" w:lineRule="auto"/>
+        <w:ind w:left="0" w:right="0" w:firstLine="0"/>
         <w:rPr>
           <w:rFonts w:ascii="Arial" w:cs="Arial" w:eastAsia="Arial" w:hAnsi="Arial"/>
           <w:color w:val="231f20"/>
@@ -620,6 +638,7 @@
           <w:tab w:val="left" w:leader="none" w:pos="2835"/>
         </w:tabs>
         <w:spacing w:after="0" w:lineRule="auto"/>
+        <w:ind w:left="0" w:right="0" w:firstLine="0"/>
         <w:rPr>
           <w:rFonts w:ascii="Arial" w:cs="Arial" w:eastAsia="Arial" w:hAnsi="Arial"/>
           <w:color w:val="231f20"/>
@@ -654,7 +673,7 @@
           <w:tab w:val="left" w:leader="none" w:pos="2835"/>
         </w:tabs>
         <w:spacing w:after="0" w:lineRule="auto"/>
-        <w:ind w:left="2410" w:hanging="2410"/>
+        <w:ind w:left="0" w:right="0" w:firstLine="0"/>
         <w:rPr>
           <w:rFonts w:ascii="Arial" w:cs="Arial" w:eastAsia="Arial" w:hAnsi="Arial"/>
           <w:color w:val="231f20"/>
@@ -689,6 +708,7 @@
           <w:tab w:val="left" w:leader="none" w:pos="2835"/>
         </w:tabs>
         <w:spacing w:after="0" w:lineRule="auto"/>
+        <w:ind w:left="0" w:right="0" w:firstLine="0"/>
         <w:rPr>
           <w:rFonts w:ascii="Arial" w:cs="Arial" w:eastAsia="Arial" w:hAnsi="Arial"/>
           <w:color w:val="231f20"/>
@@ -723,6 +743,7 @@
           <w:tab w:val="left" w:leader="none" w:pos="2835"/>
         </w:tabs>
         <w:spacing w:after="0" w:lineRule="auto"/>
+        <w:ind w:left="0" w:right="0" w:firstLine="0"/>
         <w:rPr>
           <w:rFonts w:ascii="Arial" w:cs="Arial" w:eastAsia="Arial" w:hAnsi="Arial"/>
           <w:color w:val="231f20"/>
@@ -773,6 +794,7 @@
           <w:tab w:val="left" w:leader="none" w:pos="2835"/>
         </w:tabs>
         <w:spacing w:after="0" w:lineRule="auto"/>
+        <w:ind w:left="0" w:right="0" w:firstLine="0"/>
         <w:rPr>
           <w:rFonts w:ascii="Arial" w:cs="Arial" w:eastAsia="Arial" w:hAnsi="Arial"/>
           <w:color w:val="231f20"/>
@@ -796,7 +818,7 @@
     <w:p>
       <w:pPr>
         <w:spacing w:after="0" w:line="276" w:lineRule="auto"/>
-        <w:ind w:right="0"/>
+        <w:ind w:left="0" w:right="0" w:firstLine="0"/>
         <w:jc w:val="left"/>
         <w:rPr>
           <w:rFonts w:ascii="Arial" w:cs="Arial" w:eastAsia="Arial" w:hAnsi="Arial"/>
@@ -869,7 +891,7 @@
     </w:p>
     <w:sdt>
       <w:sdtPr>
-        <w:id w:val="-1641622856"/>
+        <w:id w:val="1152581063"/>
         <w:docPartObj>
           <w:docPartGallery w:val="Table of Contents"/>
           <w:docPartUnique w:val="1"/>
@@ -892,10 +914,10 @@
             <w:shd w:fill="auto" w:val="clear"/>
             <w:tabs>
               <w:tab w:val="left" w:leader="none" w:pos="440"/>
-              <w:tab w:val="right" w:leader="dot" w:pos="9764"/>
+              <w:tab w:val="right" w:leader="none" w:pos="9764"/>
             </w:tabs>
             <w:spacing w:after="120" w:before="120" w:line="240" w:lineRule="auto"/>
-            <w:ind w:left="0" w:right="113" w:firstLine="0"/>
+            <w:ind w:left="0" w:right="0" w:firstLine="0"/>
             <w:jc w:val="left"/>
             <w:rPr>
               <w:rFonts w:ascii="Arial" w:cs="Arial" w:eastAsia="Arial" w:hAnsi="Arial"/>
@@ -916,7 +938,7 @@
             <w:instrText xml:space="preserve"> TOC \h \u \z \t "Heading 1,1,Heading 2,2,Heading 3,3,"</w:instrText>
             <w:fldChar w:fldCharType="separate"/>
           </w:r>
-          <w:hyperlink w:anchor="_5o13zcewrtw9">
+          <w:hyperlink w:anchor="_31ipnx3mb6gq">
             <w:r>
               <w:rPr>
                 <w:rFonts w:ascii="Arial" w:cs="Arial" w:eastAsia="Arial" w:hAnsi="Arial"/>
@@ -937,7 +959,7 @@
               <w:t xml:space="preserve">1</w:t>
             </w:r>
           </w:hyperlink>
-          <w:hyperlink w:anchor="_5o13zcewrtw9">
+          <w:hyperlink w:anchor="_31ipnx3mb6gq">
             <w:r>
               <w:rPr>
                 <w:rFonts w:ascii="Arial" w:cs="Arial" w:eastAsia="Arial" w:hAnsi="Arial"/>
@@ -958,7 +980,7 @@
           </w:hyperlink>
           <w:r>
             <w:fldChar w:fldCharType="begin"/>
-            <w:instrText xml:space="preserve"> PAGEREF _5o13zcewrtw9 \h </w:instrText>
+            <w:instrText xml:space="preserve"> PAGEREF _31ipnx3mb6gq \h </w:instrText>
             <w:fldChar w:fldCharType="separate"/>
           </w:r>
           <w:r>
@@ -1007,10 +1029,10 @@
             <w:shd w:fill="auto" w:val="clear"/>
             <w:tabs>
               <w:tab w:val="left" w:leader="none" w:pos="880"/>
-              <w:tab w:val="right" w:leader="dot" w:pos="9764"/>
+              <w:tab w:val="right" w:leader="none" w:pos="9764"/>
             </w:tabs>
             <w:spacing w:after="0" w:before="0" w:line="240" w:lineRule="auto"/>
-            <w:ind w:left="220" w:right="113" w:firstLine="0"/>
+            <w:ind w:left="0" w:right="0" w:firstLine="0"/>
             <w:jc w:val="left"/>
             <w:rPr>
               <w:rFonts w:ascii="Arial" w:cs="Arial" w:eastAsia="Arial" w:hAnsi="Arial"/>
@@ -1026,7 +1048,7 @@
               <w:vertAlign w:val="baseline"/>
             </w:rPr>
           </w:pPr>
-          <w:hyperlink w:anchor="_paq35xnezaop">
+          <w:hyperlink w:anchor="_qt606yhoff7b">
             <w:r>
               <w:rPr>
                 <w:rFonts w:ascii="Arial" w:cs="Arial" w:eastAsia="Arial" w:hAnsi="Arial"/>
@@ -1045,7 +1067,7 @@
               <w:t xml:space="preserve">1.1</w:t>
             </w:r>
           </w:hyperlink>
-          <w:hyperlink w:anchor="_paq35xnezaop">
+          <w:hyperlink w:anchor="_qt606yhoff7b">
             <w:r>
               <w:rPr>
                 <w:rFonts w:ascii="Arial" w:cs="Arial" w:eastAsia="Arial" w:hAnsi="Arial"/>
@@ -1066,7 +1088,7 @@
           </w:hyperlink>
           <w:r>
             <w:fldChar w:fldCharType="begin"/>
-            <w:instrText xml:space="preserve"> PAGEREF _paq35xnezaop \h </w:instrText>
+            <w:instrText xml:space="preserve"> PAGEREF _qt606yhoff7b \h </w:instrText>
             <w:fldChar w:fldCharType="separate"/>
           </w:r>
           <w:r>
@@ -1113,10 +1135,10 @@
             <w:shd w:fill="auto" w:val="clear"/>
             <w:tabs>
               <w:tab w:val="left" w:leader="none" w:pos="880"/>
-              <w:tab w:val="right" w:leader="dot" w:pos="9764"/>
+              <w:tab w:val="right" w:leader="none" w:pos="9764"/>
             </w:tabs>
             <w:spacing w:after="0" w:before="0" w:line="240" w:lineRule="auto"/>
-            <w:ind w:left="220" w:right="113" w:firstLine="0"/>
+            <w:ind w:left="0" w:right="0" w:firstLine="0"/>
             <w:jc w:val="left"/>
             <w:rPr>
               <w:rFonts w:ascii="Arial" w:cs="Arial" w:eastAsia="Arial" w:hAnsi="Arial"/>
@@ -1132,7 +1154,7 @@
               <w:vertAlign w:val="baseline"/>
             </w:rPr>
           </w:pPr>
-          <w:hyperlink w:anchor="_vaxievlv52hk">
+          <w:hyperlink w:anchor="_8bezkteulqn6">
             <w:r>
               <w:rPr>
                 <w:rFonts w:ascii="Arial" w:cs="Arial" w:eastAsia="Arial" w:hAnsi="Arial"/>
@@ -1151,7 +1173,7 @@
               <w:t xml:space="preserve">1.2</w:t>
             </w:r>
           </w:hyperlink>
-          <w:hyperlink w:anchor="_vaxievlv52hk">
+          <w:hyperlink w:anchor="_8bezkteulqn6">
             <w:r>
               <w:rPr>
                 <w:rFonts w:ascii="Arial" w:cs="Arial" w:eastAsia="Arial" w:hAnsi="Arial"/>
@@ -1172,7 +1194,7 @@
           </w:hyperlink>
           <w:r>
             <w:fldChar w:fldCharType="begin"/>
-            <w:instrText xml:space="preserve"> PAGEREF _vaxievlv52hk \h </w:instrText>
+            <w:instrText xml:space="preserve"> PAGEREF _8bezkteulqn6 \h </w:instrText>
             <w:fldChar w:fldCharType="separate"/>
           </w:r>
           <w:r>
@@ -1219,10 +1241,10 @@
             <w:shd w:fill="auto" w:val="clear"/>
             <w:tabs>
               <w:tab w:val="left" w:leader="none" w:pos="880"/>
-              <w:tab w:val="right" w:leader="dot" w:pos="9764"/>
+              <w:tab w:val="right" w:leader="none" w:pos="9764"/>
             </w:tabs>
             <w:spacing w:after="0" w:before="0" w:line="240" w:lineRule="auto"/>
-            <w:ind w:left="220" w:right="113" w:firstLine="0"/>
+            <w:ind w:left="0" w:right="0" w:firstLine="0"/>
             <w:jc w:val="left"/>
             <w:rPr>
               <w:rFonts w:ascii="Arial" w:cs="Arial" w:eastAsia="Arial" w:hAnsi="Arial"/>
@@ -1238,7 +1260,7 @@
               <w:vertAlign w:val="baseline"/>
             </w:rPr>
           </w:pPr>
-          <w:hyperlink w:anchor="_it6mnh84rnpi">
+          <w:hyperlink w:anchor="_eo3tjujxxnrv">
             <w:r>
               <w:rPr>
                 <w:rFonts w:ascii="Arial" w:cs="Arial" w:eastAsia="Arial" w:hAnsi="Arial"/>
@@ -1257,7 +1279,7 @@
               <w:t xml:space="preserve">1.3</w:t>
             </w:r>
           </w:hyperlink>
-          <w:hyperlink w:anchor="_it6mnh84rnpi">
+          <w:hyperlink w:anchor="_eo3tjujxxnrv">
             <w:r>
               <w:rPr>
                 <w:rFonts w:ascii="Arial" w:cs="Arial" w:eastAsia="Arial" w:hAnsi="Arial"/>
@@ -1278,7 +1300,7 @@
           </w:hyperlink>
           <w:r>
             <w:fldChar w:fldCharType="begin"/>
-            <w:instrText xml:space="preserve"> PAGEREF _it6mnh84rnpi \h </w:instrText>
+            <w:instrText xml:space="preserve"> PAGEREF _eo3tjujxxnrv \h </w:instrText>
             <w:fldChar w:fldCharType="separate"/>
           </w:r>
           <w:r>
@@ -1325,10 +1347,10 @@
             <w:shd w:fill="auto" w:val="clear"/>
             <w:tabs>
               <w:tab w:val="left" w:leader="none" w:pos="440"/>
-              <w:tab w:val="right" w:leader="dot" w:pos="9764"/>
+              <w:tab w:val="right" w:leader="none" w:pos="9764"/>
             </w:tabs>
             <w:spacing w:after="120" w:before="120" w:line="240" w:lineRule="auto"/>
-            <w:ind w:left="0" w:right="113" w:firstLine="0"/>
+            <w:ind w:left="0" w:right="0" w:firstLine="0"/>
             <w:jc w:val="left"/>
             <w:rPr>
               <w:rFonts w:ascii="Arial" w:cs="Arial" w:eastAsia="Arial" w:hAnsi="Arial"/>
@@ -1344,7 +1366,7 @@
               <w:vertAlign w:val="baseline"/>
             </w:rPr>
           </w:pPr>
-          <w:hyperlink w:anchor="_u9s7jm8ner16">
+          <w:hyperlink w:anchor="_ircjeoxkn5cs">
             <w:r>
               <w:rPr>
                 <w:rFonts w:ascii="Arial" w:cs="Arial" w:eastAsia="Arial" w:hAnsi="Arial"/>
@@ -1365,7 +1387,7 @@
               <w:t xml:space="preserve">2</w:t>
             </w:r>
           </w:hyperlink>
-          <w:hyperlink w:anchor="_u9s7jm8ner16">
+          <w:hyperlink w:anchor="_ircjeoxkn5cs">
             <w:r>
               <w:rPr>
                 <w:rFonts w:ascii="Arial" w:cs="Arial" w:eastAsia="Arial" w:hAnsi="Arial"/>
@@ -1386,7 +1408,7 @@
           </w:hyperlink>
           <w:r>
             <w:fldChar w:fldCharType="begin"/>
-            <w:instrText xml:space="preserve"> PAGEREF _u9s7jm8ner16 \h </w:instrText>
+            <w:instrText xml:space="preserve"> PAGEREF _ircjeoxkn5cs \h </w:instrText>
             <w:fldChar w:fldCharType="separate"/>
           </w:r>
           <w:r>
@@ -1435,10 +1457,10 @@
             <w:shd w:fill="auto" w:val="clear"/>
             <w:tabs>
               <w:tab w:val="left" w:leader="none" w:pos="880"/>
-              <w:tab w:val="right" w:leader="dot" w:pos="9764"/>
+              <w:tab w:val="right" w:leader="none" w:pos="9764"/>
             </w:tabs>
             <w:spacing w:after="0" w:before="0" w:line="240" w:lineRule="auto"/>
-            <w:ind w:left="220" w:right="113" w:firstLine="0"/>
+            <w:ind w:left="0" w:right="0" w:firstLine="0"/>
             <w:jc w:val="left"/>
             <w:rPr>
               <w:rFonts w:ascii="Arial" w:cs="Arial" w:eastAsia="Arial" w:hAnsi="Arial"/>
@@ -1454,7 +1476,7 @@
               <w:vertAlign w:val="baseline"/>
             </w:rPr>
           </w:pPr>
-          <w:hyperlink w:anchor="_gpxfkw8i6ban">
+          <w:hyperlink w:anchor="_tlfxyjeuy5kw">
             <w:r>
               <w:rPr>
                 <w:rFonts w:ascii="Arial" w:cs="Arial" w:eastAsia="Arial" w:hAnsi="Arial"/>
@@ -1473,7 +1495,7 @@
               <w:t xml:space="preserve">2.1</w:t>
             </w:r>
           </w:hyperlink>
-          <w:hyperlink w:anchor="_gpxfkw8i6ban">
+          <w:hyperlink w:anchor="_tlfxyjeuy5kw">
             <w:r>
               <w:rPr>
                 <w:rFonts w:ascii="Arial" w:cs="Arial" w:eastAsia="Arial" w:hAnsi="Arial"/>
@@ -1494,7 +1516,7 @@
           </w:hyperlink>
           <w:r>
             <w:fldChar w:fldCharType="begin"/>
-            <w:instrText xml:space="preserve"> PAGEREF _gpxfkw8i6ban \h </w:instrText>
+            <w:instrText xml:space="preserve"> PAGEREF _tlfxyjeuy5kw \h </w:instrText>
             <w:fldChar w:fldCharType="separate"/>
           </w:r>
           <w:r>
@@ -1541,10 +1563,10 @@
             <w:shd w:fill="auto" w:val="clear"/>
             <w:tabs>
               <w:tab w:val="left" w:leader="none" w:pos="880"/>
-              <w:tab w:val="right" w:leader="dot" w:pos="9764"/>
+              <w:tab w:val="right" w:leader="none" w:pos="9764"/>
             </w:tabs>
             <w:spacing w:after="0" w:before="0" w:line="240" w:lineRule="auto"/>
-            <w:ind w:left="220" w:right="113" w:firstLine="0"/>
+            <w:ind w:left="0" w:right="0" w:firstLine="0"/>
             <w:jc w:val="left"/>
             <w:rPr>
               <w:rFonts w:ascii="Arial" w:cs="Arial" w:eastAsia="Arial" w:hAnsi="Arial"/>
@@ -1560,7 +1582,7 @@
               <w:vertAlign w:val="baseline"/>
             </w:rPr>
           </w:pPr>
-          <w:hyperlink w:anchor="_m3rucwad5806">
+          <w:hyperlink w:anchor="_540penvvd74n">
             <w:r>
               <w:rPr>
                 <w:rFonts w:ascii="Arial" w:cs="Arial" w:eastAsia="Arial" w:hAnsi="Arial"/>
@@ -1579,7 +1601,7 @@
               <w:t xml:space="preserve">2.2</w:t>
             </w:r>
           </w:hyperlink>
-          <w:hyperlink w:anchor="_m3rucwad5806">
+          <w:hyperlink w:anchor="_540penvvd74n">
             <w:r>
               <w:rPr>
                 <w:rFonts w:ascii="Arial" w:cs="Arial" w:eastAsia="Arial" w:hAnsi="Arial"/>
@@ -1600,7 +1622,7 @@
           </w:hyperlink>
           <w:r>
             <w:fldChar w:fldCharType="begin"/>
-            <w:instrText xml:space="preserve"> PAGEREF _m3rucwad5806 \h </w:instrText>
+            <w:instrText xml:space="preserve"> PAGEREF _540penvvd74n \h </w:instrText>
             <w:fldChar w:fldCharType="separate"/>
           </w:r>
           <w:r>
@@ -1647,10 +1669,10 @@
             <w:shd w:fill="auto" w:val="clear"/>
             <w:tabs>
               <w:tab w:val="left" w:leader="none" w:pos="1320"/>
-              <w:tab w:val="right" w:leader="dot" w:pos="9764"/>
+              <w:tab w:val="right" w:leader="none" w:pos="9764"/>
             </w:tabs>
             <w:spacing w:after="0" w:before="0" w:line="240" w:lineRule="auto"/>
-            <w:ind w:left="440" w:right="113" w:firstLine="0"/>
+            <w:ind w:left="0" w:right="0" w:firstLine="0"/>
             <w:jc w:val="left"/>
             <w:rPr>
               <w:rFonts w:ascii="Arial" w:cs="Arial" w:eastAsia="Arial" w:hAnsi="Arial"/>
@@ -1666,7 +1688,7 @@
               <w:vertAlign w:val="baseline"/>
             </w:rPr>
           </w:pPr>
-          <w:hyperlink w:anchor="_nxw1b59yrd5">
+          <w:hyperlink w:anchor="_w55tms3yheid">
             <w:r>
               <w:rPr>
                 <w:rFonts w:ascii="Arial" w:cs="Arial" w:eastAsia="Arial" w:hAnsi="Arial"/>
@@ -1685,7 +1707,7 @@
               <w:t xml:space="preserve">2.2.1</w:t>
             </w:r>
           </w:hyperlink>
-          <w:hyperlink w:anchor="_nxw1b59yrd5">
+          <w:hyperlink w:anchor="_w55tms3yheid">
             <w:r>
               <w:rPr>
                 <w:rFonts w:ascii="Arial" w:cs="Arial" w:eastAsia="Arial" w:hAnsi="Arial"/>
@@ -1706,7 +1728,7 @@
           </w:hyperlink>
           <w:r>
             <w:fldChar w:fldCharType="begin"/>
-            <w:instrText xml:space="preserve"> PAGEREF _nxw1b59yrd5 \h </w:instrText>
+            <w:instrText xml:space="preserve"> PAGEREF _w55tms3yheid \h </w:instrText>
             <w:fldChar w:fldCharType="separate"/>
           </w:r>
           <w:r>
@@ -1753,10 +1775,10 @@
             <w:shd w:fill="auto" w:val="clear"/>
             <w:tabs>
               <w:tab w:val="left" w:leader="none" w:pos="1320"/>
-              <w:tab w:val="right" w:leader="dot" w:pos="9764"/>
+              <w:tab w:val="right" w:leader="none" w:pos="9764"/>
             </w:tabs>
             <w:spacing w:after="0" w:before="0" w:line="240" w:lineRule="auto"/>
-            <w:ind w:left="440" w:right="113" w:firstLine="0"/>
+            <w:ind w:left="0" w:right="0" w:firstLine="0"/>
             <w:jc w:val="left"/>
             <w:rPr>
               <w:rFonts w:ascii="Arial" w:cs="Arial" w:eastAsia="Arial" w:hAnsi="Arial"/>
@@ -1772,7 +1794,7 @@
               <w:vertAlign w:val="baseline"/>
             </w:rPr>
           </w:pPr>
-          <w:hyperlink w:anchor="_cicx3t2dboej">
+          <w:hyperlink w:anchor="_drvvmhvgg9ai">
             <w:r>
               <w:rPr>
                 <w:rFonts w:ascii="Arial" w:cs="Arial" w:eastAsia="Arial" w:hAnsi="Arial"/>
@@ -1791,7 +1813,7 @@
               <w:t xml:space="preserve">2.2.1.1</w:t>
             </w:r>
           </w:hyperlink>
-          <w:hyperlink w:anchor="_cicx3t2dboej">
+          <w:hyperlink w:anchor="_drvvmhvgg9ai">
             <w:r>
               <w:rPr>
                 <w:rFonts w:ascii="Arial" w:cs="Arial" w:eastAsia="Arial" w:hAnsi="Arial"/>
@@ -1812,7 +1834,7 @@
           </w:hyperlink>
           <w:r>
             <w:fldChar w:fldCharType="begin"/>
-            <w:instrText xml:space="preserve"> PAGEREF _cicx3t2dboej \h </w:instrText>
+            <w:instrText xml:space="preserve"> PAGEREF _drvvmhvgg9ai \h </w:instrText>
             <w:fldChar w:fldCharType="separate"/>
           </w:r>
           <w:r>
@@ -1859,10 +1881,10 @@
             <w:shd w:fill="auto" w:val="clear"/>
             <w:tabs>
               <w:tab w:val="left" w:leader="none" w:pos="1320"/>
-              <w:tab w:val="right" w:leader="dot" w:pos="9764"/>
+              <w:tab w:val="right" w:leader="none" w:pos="9764"/>
             </w:tabs>
             <w:spacing w:after="0" w:before="0" w:line="240" w:lineRule="auto"/>
-            <w:ind w:left="440" w:right="113" w:firstLine="0"/>
+            <w:ind w:left="0" w:right="0" w:firstLine="0"/>
             <w:jc w:val="left"/>
             <w:rPr>
               <w:rFonts w:ascii="Arial" w:cs="Arial" w:eastAsia="Arial" w:hAnsi="Arial"/>
@@ -1878,7 +1900,7 @@
               <w:vertAlign w:val="baseline"/>
             </w:rPr>
           </w:pPr>
-          <w:hyperlink w:anchor="_dckmo69tnedl">
+          <w:hyperlink w:anchor="_jbss6p4cl0ev">
             <w:r>
               <w:rPr>
                 <w:rFonts w:ascii="Arial" w:cs="Arial" w:eastAsia="Arial" w:hAnsi="Arial"/>
@@ -1897,7 +1919,7 @@
               <w:t xml:space="preserve">2.2.1.2</w:t>
             </w:r>
           </w:hyperlink>
-          <w:hyperlink w:anchor="_dckmo69tnedl">
+          <w:hyperlink w:anchor="_jbss6p4cl0ev">
             <w:r>
               <w:rPr>
                 <w:rFonts w:ascii="Arial" w:cs="Arial" w:eastAsia="Arial" w:hAnsi="Arial"/>
@@ -1918,7 +1940,7 @@
           </w:hyperlink>
           <w:r>
             <w:fldChar w:fldCharType="begin"/>
-            <w:instrText xml:space="preserve"> PAGEREF _dckmo69tnedl \h </w:instrText>
+            <w:instrText xml:space="preserve"> PAGEREF _jbss6p4cl0ev \h </w:instrText>
             <w:fldChar w:fldCharType="separate"/>
           </w:r>
           <w:r>
@@ -1965,10 +1987,10 @@
             <w:shd w:fill="auto" w:val="clear"/>
             <w:tabs>
               <w:tab w:val="left" w:leader="none" w:pos="1320"/>
-              <w:tab w:val="right" w:leader="dot" w:pos="9764"/>
+              <w:tab w:val="right" w:leader="none" w:pos="9764"/>
             </w:tabs>
             <w:spacing w:after="0" w:before="0" w:line="240" w:lineRule="auto"/>
-            <w:ind w:left="440" w:right="113" w:firstLine="0"/>
+            <w:ind w:left="0" w:right="0" w:firstLine="0"/>
             <w:jc w:val="left"/>
             <w:rPr>
               <w:rFonts w:ascii="Arial" w:cs="Arial" w:eastAsia="Arial" w:hAnsi="Arial"/>
@@ -1984,7 +2006,7 @@
               <w:vertAlign w:val="baseline"/>
             </w:rPr>
           </w:pPr>
-          <w:hyperlink w:anchor="_ycr2nl3n1xwg">
+          <w:hyperlink w:anchor="_dlpq3avidoeq">
             <w:r>
               <w:rPr>
                 <w:rFonts w:ascii="Arial" w:cs="Arial" w:eastAsia="Arial" w:hAnsi="Arial"/>
@@ -2003,7 +2025,7 @@
               <w:t xml:space="preserve">2.2.1.3</w:t>
             </w:r>
           </w:hyperlink>
-          <w:hyperlink w:anchor="_ycr2nl3n1xwg">
+          <w:hyperlink w:anchor="_dlpq3avidoeq">
             <w:r>
               <w:rPr>
                 <w:rFonts w:ascii="Arial" w:cs="Arial" w:eastAsia="Arial" w:hAnsi="Arial"/>
@@ -2024,7 +2046,7 @@
           </w:hyperlink>
           <w:r>
             <w:fldChar w:fldCharType="begin"/>
-            <w:instrText xml:space="preserve"> PAGEREF _ycr2nl3n1xwg \h </w:instrText>
+            <w:instrText xml:space="preserve"> PAGEREF _dlpq3avidoeq \h </w:instrText>
             <w:fldChar w:fldCharType="separate"/>
           </w:r>
           <w:r>
@@ -2071,10 +2093,10 @@
             <w:shd w:fill="auto" w:val="clear"/>
             <w:tabs>
               <w:tab w:val="left" w:leader="none" w:pos="1320"/>
-              <w:tab w:val="right" w:leader="dot" w:pos="9764"/>
+              <w:tab w:val="right" w:leader="none" w:pos="9764"/>
             </w:tabs>
             <w:spacing w:after="0" w:before="0" w:line="240" w:lineRule="auto"/>
-            <w:ind w:left="440" w:right="113" w:firstLine="0"/>
+            <w:ind w:left="0" w:right="0" w:firstLine="0"/>
             <w:jc w:val="left"/>
             <w:rPr>
               <w:rFonts w:ascii="Arial" w:cs="Arial" w:eastAsia="Arial" w:hAnsi="Arial"/>
@@ -2090,7 +2112,7 @@
               <w:vertAlign w:val="baseline"/>
             </w:rPr>
           </w:pPr>
-          <w:hyperlink w:anchor="_37u1482a7bl">
+          <w:hyperlink w:anchor="_vd1r9g6axoz4">
             <w:r>
               <w:rPr>
                 <w:rFonts w:ascii="Arial" w:cs="Arial" w:eastAsia="Arial" w:hAnsi="Arial"/>
@@ -2109,7 +2131,7 @@
               <w:t xml:space="preserve">2.2.1.4</w:t>
             </w:r>
           </w:hyperlink>
-          <w:hyperlink w:anchor="_37u1482a7bl">
+          <w:hyperlink w:anchor="_vd1r9g6axoz4">
             <w:r>
               <w:rPr>
                 <w:rFonts w:ascii="Arial" w:cs="Arial" w:eastAsia="Arial" w:hAnsi="Arial"/>
@@ -2130,7 +2152,7 @@
           </w:hyperlink>
           <w:r>
             <w:fldChar w:fldCharType="begin"/>
-            <w:instrText xml:space="preserve"> PAGEREF _37u1482a7bl \h </w:instrText>
+            <w:instrText xml:space="preserve"> PAGEREF _vd1r9g6axoz4 \h </w:instrText>
             <w:fldChar w:fldCharType="separate"/>
           </w:r>
           <w:r>
@@ -2177,10 +2199,10 @@
             <w:shd w:fill="auto" w:val="clear"/>
             <w:tabs>
               <w:tab w:val="left" w:leader="none" w:pos="1320"/>
-              <w:tab w:val="right" w:leader="dot" w:pos="9764"/>
+              <w:tab w:val="right" w:leader="none" w:pos="9764"/>
             </w:tabs>
             <w:spacing w:after="0" w:before="0" w:line="240" w:lineRule="auto"/>
-            <w:ind w:left="440" w:right="113" w:firstLine="0"/>
+            <w:ind w:left="0" w:right="0" w:firstLine="0"/>
             <w:jc w:val="left"/>
             <w:rPr>
               <w:rFonts w:ascii="Arial" w:cs="Arial" w:eastAsia="Arial" w:hAnsi="Arial"/>
@@ -2196,7 +2218,7 @@
               <w:vertAlign w:val="baseline"/>
             </w:rPr>
           </w:pPr>
-          <w:hyperlink w:anchor="_936ndgecxy8x">
+          <w:hyperlink w:anchor="_145oc2dqpux5">
             <w:r>
               <w:rPr>
                 <w:rFonts w:ascii="Arial" w:cs="Arial" w:eastAsia="Arial" w:hAnsi="Arial"/>
@@ -2215,7 +2237,7 @@
               <w:t xml:space="preserve">2.2.2</w:t>
             </w:r>
           </w:hyperlink>
-          <w:hyperlink w:anchor="_936ndgecxy8x">
+          <w:hyperlink w:anchor="_145oc2dqpux5">
             <w:r>
               <w:rPr>
                 <w:rFonts w:ascii="Arial" w:cs="Arial" w:eastAsia="Arial" w:hAnsi="Arial"/>
@@ -2236,7 +2258,7 @@
           </w:hyperlink>
           <w:r>
             <w:fldChar w:fldCharType="begin"/>
-            <w:instrText xml:space="preserve"> PAGEREF _936ndgecxy8x \h </w:instrText>
+            <w:instrText xml:space="preserve"> PAGEREF _145oc2dqpux5 \h </w:instrText>
             <w:fldChar w:fldCharType="separate"/>
           </w:r>
           <w:r>
@@ -2283,10 +2305,10 @@
             <w:shd w:fill="auto" w:val="clear"/>
             <w:tabs>
               <w:tab w:val="left" w:leader="none" w:pos="1320"/>
-              <w:tab w:val="right" w:leader="dot" w:pos="9764"/>
+              <w:tab w:val="right" w:leader="none" w:pos="9764"/>
             </w:tabs>
             <w:spacing w:after="0" w:before="0" w:line="240" w:lineRule="auto"/>
-            <w:ind w:left="440" w:right="113" w:firstLine="0"/>
+            <w:ind w:left="0" w:right="0" w:firstLine="0"/>
             <w:jc w:val="left"/>
             <w:rPr>
               <w:rFonts w:ascii="Arial" w:cs="Arial" w:eastAsia="Arial" w:hAnsi="Arial"/>
@@ -2302,7 +2324,7 @@
               <w:vertAlign w:val="baseline"/>
             </w:rPr>
           </w:pPr>
-          <w:hyperlink w:anchor="_blo82m395dmh">
+          <w:hyperlink w:anchor="_mgj1r99crmn5">
             <w:r>
               <w:rPr>
                 <w:rFonts w:ascii="Arial" w:cs="Arial" w:eastAsia="Arial" w:hAnsi="Arial"/>
@@ -2321,7 +2343,7 @@
               <w:t xml:space="preserve">2.2.2.1</w:t>
             </w:r>
           </w:hyperlink>
-          <w:hyperlink w:anchor="_blo82m395dmh">
+          <w:hyperlink w:anchor="_mgj1r99crmn5">
             <w:r>
               <w:rPr>
                 <w:rFonts w:ascii="Arial" w:cs="Arial" w:eastAsia="Arial" w:hAnsi="Arial"/>
@@ -2342,7 +2364,7 @@
           </w:hyperlink>
           <w:r>
             <w:fldChar w:fldCharType="begin"/>
-            <w:instrText xml:space="preserve"> PAGEREF _blo82m395dmh \h </w:instrText>
+            <w:instrText xml:space="preserve"> PAGEREF _mgj1r99crmn5 \h </w:instrText>
             <w:fldChar w:fldCharType="separate"/>
           </w:r>
           <w:r>
@@ -2389,10 +2411,10 @@
             <w:shd w:fill="auto" w:val="clear"/>
             <w:tabs>
               <w:tab w:val="left" w:leader="none" w:pos="1320"/>
-              <w:tab w:val="right" w:leader="dot" w:pos="9764"/>
+              <w:tab w:val="right" w:leader="none" w:pos="9764"/>
             </w:tabs>
             <w:spacing w:after="0" w:before="0" w:line="240" w:lineRule="auto"/>
-            <w:ind w:left="440" w:right="113" w:firstLine="0"/>
+            <w:ind w:left="0" w:right="0" w:firstLine="0"/>
             <w:jc w:val="left"/>
             <w:rPr>
               <w:rFonts w:ascii="Arial" w:cs="Arial" w:eastAsia="Arial" w:hAnsi="Arial"/>
@@ -2408,7 +2430,7 @@
               <w:vertAlign w:val="baseline"/>
             </w:rPr>
           </w:pPr>
-          <w:hyperlink w:anchor="_tub5sl6i7g4l">
+          <w:hyperlink w:anchor="_tl8rgn4twqn3">
             <w:r>
               <w:rPr>
                 <w:rFonts w:ascii="Arial" w:cs="Arial" w:eastAsia="Arial" w:hAnsi="Arial"/>
@@ -2427,7 +2449,7 @@
               <w:t xml:space="preserve">2.2.2.2</w:t>
             </w:r>
           </w:hyperlink>
-          <w:hyperlink w:anchor="_tub5sl6i7g4l">
+          <w:hyperlink w:anchor="_tl8rgn4twqn3">
             <w:r>
               <w:rPr>
                 <w:rFonts w:ascii="Arial" w:cs="Arial" w:eastAsia="Arial" w:hAnsi="Arial"/>
@@ -2448,7 +2470,7 @@
           </w:hyperlink>
           <w:r>
             <w:fldChar w:fldCharType="begin"/>
-            <w:instrText xml:space="preserve"> PAGEREF _tub5sl6i7g4l \h </w:instrText>
+            <w:instrText xml:space="preserve"> PAGEREF _tl8rgn4twqn3 \h </w:instrText>
             <w:fldChar w:fldCharType="separate"/>
           </w:r>
           <w:r>
@@ -2495,10 +2517,10 @@
             <w:shd w:fill="auto" w:val="clear"/>
             <w:tabs>
               <w:tab w:val="left" w:leader="none" w:pos="1320"/>
-              <w:tab w:val="right" w:leader="dot" w:pos="9764"/>
+              <w:tab w:val="right" w:leader="none" w:pos="9764"/>
             </w:tabs>
             <w:spacing w:after="0" w:before="0" w:line="240" w:lineRule="auto"/>
-            <w:ind w:left="440" w:right="113" w:firstLine="0"/>
+            <w:ind w:left="0" w:right="0" w:firstLine="0"/>
             <w:jc w:val="left"/>
             <w:rPr>
               <w:rFonts w:ascii="Arial" w:cs="Arial" w:eastAsia="Arial" w:hAnsi="Arial"/>
@@ -2514,7 +2536,7 @@
               <w:vertAlign w:val="baseline"/>
             </w:rPr>
           </w:pPr>
-          <w:hyperlink w:anchor="_gltxn8z3fbq5">
+          <w:hyperlink w:anchor="_kdwlycg4k7e1">
             <w:r>
               <w:rPr>
                 <w:rFonts w:ascii="Arial" w:cs="Arial" w:eastAsia="Arial" w:hAnsi="Arial"/>
@@ -2533,7 +2555,7 @@
               <w:t xml:space="preserve">2.2.2.3</w:t>
             </w:r>
           </w:hyperlink>
-          <w:hyperlink w:anchor="_gltxn8z3fbq5">
+          <w:hyperlink w:anchor="_kdwlycg4k7e1">
             <w:r>
               <w:rPr>
                 <w:rFonts w:ascii="Arial" w:cs="Arial" w:eastAsia="Arial" w:hAnsi="Arial"/>
@@ -2554,7 +2576,7 @@
           </w:hyperlink>
           <w:r>
             <w:fldChar w:fldCharType="begin"/>
-            <w:instrText xml:space="preserve"> PAGEREF _gltxn8z3fbq5 \h </w:instrText>
+            <w:instrText xml:space="preserve"> PAGEREF _kdwlycg4k7e1 \h </w:instrText>
             <w:fldChar w:fldCharType="separate"/>
           </w:r>
           <w:r>
@@ -2601,10 +2623,10 @@
             <w:shd w:fill="auto" w:val="clear"/>
             <w:tabs>
               <w:tab w:val="left" w:leader="none" w:pos="880"/>
-              <w:tab w:val="right" w:leader="dot" w:pos="9764"/>
+              <w:tab w:val="right" w:leader="none" w:pos="9764"/>
             </w:tabs>
             <w:spacing w:after="0" w:before="0" w:line="240" w:lineRule="auto"/>
-            <w:ind w:left="220" w:right="113" w:firstLine="0"/>
+            <w:ind w:left="0" w:right="0" w:firstLine="0"/>
             <w:jc w:val="left"/>
             <w:rPr>
               <w:rFonts w:ascii="Arial" w:cs="Arial" w:eastAsia="Arial" w:hAnsi="Arial"/>
@@ -2620,7 +2642,7 @@
               <w:vertAlign w:val="baseline"/>
             </w:rPr>
           </w:pPr>
-          <w:hyperlink w:anchor="_5pvxsc3jvbpl">
+          <w:hyperlink w:anchor="_b3i82938a1tx">
             <w:r>
               <w:rPr>
                 <w:rFonts w:ascii="Arial" w:cs="Arial" w:eastAsia="Arial" w:hAnsi="Arial"/>
@@ -2639,7 +2661,7 @@
               <w:t xml:space="preserve">2.3</w:t>
             </w:r>
           </w:hyperlink>
-          <w:hyperlink w:anchor="_5pvxsc3jvbpl">
+          <w:hyperlink w:anchor="_b3i82938a1tx">
             <w:r>
               <w:rPr>
                 <w:rFonts w:ascii="Arial" w:cs="Arial" w:eastAsia="Arial" w:hAnsi="Arial"/>
@@ -2660,7 +2682,7 @@
           </w:hyperlink>
           <w:r>
             <w:fldChar w:fldCharType="begin"/>
-            <w:instrText xml:space="preserve"> PAGEREF _5pvxsc3jvbpl \h </w:instrText>
+            <w:instrText xml:space="preserve"> PAGEREF _b3i82938a1tx \h </w:instrText>
             <w:fldChar w:fldCharType="separate"/>
           </w:r>
           <w:r>
@@ -2706,10 +2728,10 @@
             </w:pBdr>
             <w:shd w:fill="auto" w:val="clear"/>
             <w:tabs>
-              <w:tab w:val="right" w:leader="dot" w:pos="9764"/>
+              <w:tab w:val="right" w:leader="none" w:pos="9764"/>
             </w:tabs>
             <w:spacing w:after="120" w:before="120" w:line="240" w:lineRule="auto"/>
-            <w:ind w:left="0" w:right="113" w:firstLine="0"/>
+            <w:ind w:left="0" w:right="0" w:firstLine="0"/>
             <w:jc w:val="left"/>
             <w:rPr>
               <w:rFonts w:ascii="Arial" w:cs="Arial" w:eastAsia="Arial" w:hAnsi="Arial"/>
@@ -2725,7 +2747,7 @@
               <w:vertAlign w:val="baseline"/>
             </w:rPr>
           </w:pPr>
-          <w:hyperlink w:anchor="_uvfiez9lf0km">
+          <w:hyperlink w:anchor="_r5bayxr2zy5b">
             <w:r>
               <w:rPr>
                 <w:rFonts w:ascii="Arial" w:cs="Arial" w:eastAsia="Arial" w:hAnsi="Arial"/>
@@ -2769,10 +2791,10 @@
             </w:pBdr>
             <w:shd w:fill="auto" w:val="clear"/>
             <w:tabs>
-              <w:tab w:val="right" w:leader="dot" w:pos="9764"/>
+              <w:tab w:val="right" w:leader="none" w:pos="9764"/>
             </w:tabs>
             <w:spacing w:after="120" w:before="120" w:line="240" w:lineRule="auto"/>
-            <w:ind w:left="0" w:right="113" w:firstLine="0"/>
+            <w:ind w:left="0" w:right="0" w:firstLine="0"/>
             <w:jc w:val="left"/>
             <w:rPr>
               <w:rFonts w:ascii="Arial" w:cs="Arial" w:eastAsia="Arial" w:hAnsi="Arial"/>
@@ -2788,7 +2810,7 @@
               <w:vertAlign w:val="baseline"/>
             </w:rPr>
           </w:pPr>
-          <w:hyperlink w:anchor="_crcf0yyrh6dm">
+          <w:hyperlink w:anchor="_4fl30xiojlow">
             <w:r>
               <w:rPr>
                 <w:rFonts w:ascii="Arial" w:cs="Arial" w:eastAsia="Arial" w:hAnsi="Arial"/>
@@ -2832,10 +2854,10 @@
             </w:pBdr>
             <w:shd w:fill="auto" w:val="clear"/>
             <w:tabs>
-              <w:tab w:val="right" w:leader="dot" w:pos="9764"/>
+              <w:tab w:val="right" w:leader="none" w:pos="9764"/>
             </w:tabs>
             <w:spacing w:after="120" w:before="120" w:line="240" w:lineRule="auto"/>
-            <w:ind w:left="0" w:right="113" w:firstLine="0"/>
+            <w:ind w:left="0" w:right="0" w:firstLine="0"/>
             <w:jc w:val="left"/>
             <w:rPr>
               <w:rFonts w:ascii="Arial" w:cs="Arial" w:eastAsia="Arial" w:hAnsi="Arial"/>
@@ -2851,7 +2873,7 @@
               <w:vertAlign w:val="baseline"/>
             </w:rPr>
           </w:pPr>
-          <w:hyperlink w:anchor="_rh9pwd9vdfvg">
+          <w:hyperlink w:anchor="_awssxfqq7ejp">
             <w:r>
               <w:rPr>
                 <w:rFonts w:ascii="Arial" w:cs="Arial" w:eastAsia="Arial" w:hAnsi="Arial"/>
@@ -2890,6 +2912,7 @@
         <w:tabs>
           <w:tab w:val="left" w:leader="none" w:pos="6720"/>
         </w:tabs>
+        <w:ind w:left="0" w:right="0" w:firstLine="0"/>
         <w:rPr>
           <w:rFonts w:ascii="Arial" w:cs="Arial" w:eastAsia="Arial" w:hAnsi="Arial"/>
           <w:b w:val="1"/>
@@ -2913,6 +2936,7 @@
         <w:tabs>
           <w:tab w:val="left" w:leader="none" w:pos="6720"/>
         </w:tabs>
+        <w:ind w:left="0" w:right="0" w:firstLine="0"/>
         <w:rPr>
           <w:rFonts w:ascii="Arial" w:cs="Arial" w:eastAsia="Arial" w:hAnsi="Arial"/>
           <w:b w:val="1"/>
@@ -2931,6 +2955,7 @@
         <w:tabs>
           <w:tab w:val="left" w:leader="none" w:pos="6720"/>
         </w:tabs>
+        <w:ind w:left="0" w:right="0" w:firstLine="0"/>
         <w:rPr>
           <w:rFonts w:ascii="Arial" w:cs="Arial" w:eastAsia="Arial" w:hAnsi="Arial"/>
           <w:b w:val="1"/>
@@ -2949,6 +2974,7 @@
         <w:tabs>
           <w:tab w:val="left" w:leader="none" w:pos="6720"/>
         </w:tabs>
+        <w:ind w:left="0" w:right="0" w:firstLine="0"/>
         <w:rPr>
           <w:rFonts w:ascii="Arial" w:cs="Arial" w:eastAsia="Arial" w:hAnsi="Arial"/>
           <w:b w:val="1"/>
@@ -2967,6 +2993,7 @@
         <w:tabs>
           <w:tab w:val="left" w:leader="none" w:pos="6720"/>
         </w:tabs>
+        <w:ind w:left="0" w:right="0" w:firstLine="0"/>
         <w:rPr>
           <w:rFonts w:ascii="Arial" w:cs="Arial" w:eastAsia="Arial" w:hAnsi="Arial"/>
           <w:b w:val="1"/>
@@ -2985,6 +3012,7 @@
         <w:tabs>
           <w:tab w:val="left" w:leader="none" w:pos="6720"/>
         </w:tabs>
+        <w:ind w:left="0" w:right="0" w:firstLine="0"/>
         <w:rPr>
           <w:rFonts w:ascii="Arial" w:cs="Arial" w:eastAsia="Arial" w:hAnsi="Arial"/>
           <w:b w:val="1"/>
@@ -3003,6 +3031,7 @@
         <w:tabs>
           <w:tab w:val="left" w:leader="none" w:pos="6720"/>
         </w:tabs>
+        <w:ind w:left="0" w:right="0" w:firstLine="0"/>
         <w:rPr>
           <w:rFonts w:ascii="Arial" w:cs="Arial" w:eastAsia="Arial" w:hAnsi="Arial"/>
           <w:b w:val="1"/>
@@ -3021,6 +3050,7 @@
         <w:tabs>
           <w:tab w:val="left" w:leader="none" w:pos="6720"/>
         </w:tabs>
+        <w:ind w:left="0" w:right="0" w:firstLine="0"/>
         <w:rPr>
           <w:rFonts w:ascii="Arial" w:cs="Arial" w:eastAsia="Arial" w:hAnsi="Arial"/>
           <w:b w:val="1"/>
@@ -3039,6 +3069,7 @@
         <w:tabs>
           <w:tab w:val="left" w:leader="none" w:pos="6720"/>
         </w:tabs>
+        <w:ind w:left="0" w:right="0" w:firstLine="0"/>
         <w:rPr>
           <w:rFonts w:ascii="Arial" w:cs="Arial" w:eastAsia="Arial" w:hAnsi="Arial"/>
           <w:b w:val="1"/>
@@ -3057,6 +3088,7 @@
         <w:tabs>
           <w:tab w:val="left" w:leader="none" w:pos="6720"/>
         </w:tabs>
+        <w:ind w:left="0" w:right="0" w:firstLine="0"/>
         <w:rPr>
           <w:rFonts w:ascii="Arial" w:cs="Arial" w:eastAsia="Arial" w:hAnsi="Arial"/>
           <w:b w:val="1"/>
@@ -3073,7 +3105,7 @@
     <w:p>
       <w:pPr>
         <w:spacing w:after="200" w:line="276" w:lineRule="auto"/>
-        <w:ind w:right="0"/>
+        <w:ind w:left="0" w:right="0" w:firstLine="0"/>
         <w:jc w:val="center"/>
         <w:rPr>
           <w:rFonts w:ascii="Arial" w:cs="Arial" w:eastAsia="Arial" w:hAnsi="Arial"/>
@@ -3098,6 +3130,7 @@
         <w:tabs>
           <w:tab w:val="left" w:leader="none" w:pos="6720"/>
         </w:tabs>
+        <w:ind w:left="0" w:right="0" w:firstLine="0"/>
         <w:rPr>
           <w:rFonts w:ascii="Arial" w:cs="Arial" w:eastAsia="Arial" w:hAnsi="Arial"/>
           <w:b w:val="1"/>
@@ -3114,14 +3147,14 @@
     <w:p>
       <w:pPr>
         <w:spacing w:after="200" w:line="276" w:lineRule="auto"/>
-        <w:ind w:right="0"/>
+        <w:ind w:left="0" w:right="0" w:firstLine="0"/>
         <w:jc w:val="left"/>
         <w:rPr>
           <w:rFonts w:ascii="Arial" w:cs="Arial" w:eastAsia="Arial" w:hAnsi="Arial"/>
           <w:color w:val="231f20"/>
         </w:rPr>
       </w:pPr>
-      <w:bookmarkStart w:colFirst="0" w:colLast="0" w:name="_hel0y9gmoez1" w:id="1"/>
+      <w:bookmarkStart w:colFirst="0" w:colLast="0" w:name="_z13rq0l31cuj" w:id="1"/>
       <w:bookmarkEnd w:id="1"/>
       <w:r>
         <w:br w:type="page"/>
@@ -3139,13 +3172,13 @@
           <w:ilvl w:val="0"/>
           <w:numId w:val="1"/>
         </w:numPr>
-        <w:ind w:left="432" w:hanging="432"/>
-        <w:rPr>
-          <w:rFonts w:ascii="Arial" w:cs="Arial" w:eastAsia="Arial" w:hAnsi="Arial"/>
-          <w:color w:val="231f20"/>
-        </w:rPr>
-      </w:pPr>
-      <w:bookmarkStart w:colFirst="0" w:colLast="0" w:name="_5o13zcewrtw9" w:id="2"/>
+        <w:ind w:left="0" w:right="0" w:firstLine="0"/>
+        <w:rPr>
+          <w:rFonts w:ascii="Arial" w:cs="Arial" w:eastAsia="Arial" w:hAnsi="Arial"/>
+          <w:color w:val="231f20"/>
+        </w:rPr>
+      </w:pPr>
+      <w:bookmarkStart w:colFirst="0" w:colLast="0" w:name="_31ipnx3mb6gq" w:id="2"/>
       <w:bookmarkEnd w:id="2"/>
       <w:r>
         <w:rPr>
@@ -3163,13 +3196,10 @@
           <w:ilvl w:val="1"/>
           <w:numId w:val="1"/>
         </w:numPr>
-        <w:ind w:left="576" w:hanging="576"/>
-        <w:rPr>
-          <w:rFonts w:ascii="Arial" w:cs="Arial" w:eastAsia="Arial" w:hAnsi="Arial"/>
-          <w:color w:val="231f20"/>
-        </w:rPr>
-      </w:pPr>
-      <w:bookmarkStart w:colFirst="0" w:colLast="0" w:name="_paq35xnezaop" w:id="3"/>
+        <w:ind w:left="0" w:right="0" w:firstLine="0"/>
+        <w:rPr/>
+      </w:pPr>
+      <w:bookmarkStart w:colFirst="0" w:colLast="0" w:name="_qt606yhoff7b" w:id="3"/>
       <w:bookmarkEnd w:id="3"/>
       <w:r>
         <w:rPr>
@@ -3183,6 +3213,7 @@
     <w:p>
       <w:pPr>
         <w:spacing w:before="240" w:lineRule="auto"/>
+        <w:ind w:left="0" w:right="0" w:firstLine="0"/>
         <w:rPr>
           <w:rFonts w:ascii="Arial" w:cs="Arial" w:eastAsia="Arial" w:hAnsi="Arial"/>
           <w:color w:val="231f20"/>
@@ -3212,13 +3243,10 @@
           <w:numId w:val="1"/>
         </w:numPr>
         <w:spacing w:before="0" w:lineRule="auto"/>
-        <w:ind w:left="576" w:hanging="576"/>
-        <w:rPr>
-          <w:rFonts w:ascii="Arial" w:cs="Arial" w:eastAsia="Arial" w:hAnsi="Arial"/>
-          <w:color w:val="231f20"/>
-        </w:rPr>
-      </w:pPr>
-      <w:bookmarkStart w:colFirst="0" w:colLast="0" w:name="_vaxievlv52hk" w:id="4"/>
+        <w:ind w:left="0" w:right="0" w:firstLine="0"/>
+        <w:rPr/>
+      </w:pPr>
+      <w:bookmarkStart w:colFirst="0" w:colLast="0" w:name="_8bezkteulqn6" w:id="4"/>
       <w:bookmarkEnd w:id="4"/>
       <w:r>
         <w:rPr>
@@ -3231,6 +3259,7 @@
     </w:p>
     <w:p>
       <w:pPr>
+        <w:ind w:left="0" w:right="0" w:firstLine="0"/>
         <w:rPr>
           <w:rFonts w:ascii="Arial" w:cs="Arial" w:eastAsia="Arial" w:hAnsi="Arial"/>
           <w:color w:val="231f20"/>
@@ -3247,6 +3276,7 @@
     </w:p>
     <w:p>
       <w:pPr>
+        <w:ind w:left="0" w:right="0" w:firstLine="0"/>
         <w:rPr>
           <w:rFonts w:ascii="Arial" w:cs="Arial" w:eastAsia="Arial" w:hAnsi="Arial"/>
           <w:color w:val="231f20"/>
@@ -3268,13 +3298,10 @@
           <w:ilvl w:val="1"/>
           <w:numId w:val="1"/>
         </w:numPr>
-        <w:ind w:left="576" w:hanging="576"/>
-        <w:rPr>
-          <w:rFonts w:ascii="Arial" w:cs="Arial" w:eastAsia="Arial" w:hAnsi="Arial"/>
-          <w:color w:val="231f20"/>
-        </w:rPr>
-      </w:pPr>
-      <w:bookmarkStart w:colFirst="0" w:colLast="0" w:name="_it6mnh84rnpi" w:id="5"/>
+        <w:ind w:left="0" w:right="0" w:firstLine="0"/>
+        <w:rPr/>
+      </w:pPr>
+      <w:bookmarkStart w:colFirst="0" w:colLast="0" w:name="_eo3tjujxxnrv" w:id="5"/>
       <w:bookmarkEnd w:id="5"/>
       <w:r>
         <w:rPr>
@@ -3287,6 +3314,7 @@
     </w:p>
     <w:p>
       <w:pPr>
+        <w:ind w:left="0" w:right="0" w:firstLine="0"/>
         <w:rPr>
           <w:rFonts w:ascii="Arial" w:cs="Arial" w:eastAsia="Arial" w:hAnsi="Arial"/>
           <w:color w:val="231f20"/>
@@ -3313,6 +3341,7 @@
     </w:p>
     <w:p>
       <w:pPr>
+        <w:ind w:left="0" w:right="0" w:firstLine="0"/>
         <w:rPr>
           <w:rFonts w:ascii="Arial" w:cs="Arial" w:eastAsia="Arial" w:hAnsi="Arial"/>
           <w:color w:val="231f20"/>
@@ -3339,6 +3368,7 @@
     </w:p>
     <w:p>
       <w:pPr>
+        <w:ind w:left="0" w:right="0" w:firstLine="0"/>
         <w:rPr>
           <w:rFonts w:ascii="Arial" w:cs="Arial" w:eastAsia="Arial" w:hAnsi="Arial"/>
           <w:color w:val="231f20"/>
@@ -3365,6 +3395,7 @@
     </w:p>
     <w:p>
       <w:pPr>
+        <w:ind w:left="0" w:right="0" w:firstLine="0"/>
         <w:rPr>
           <w:rFonts w:ascii="Arial" w:cs="Arial" w:eastAsia="Arial" w:hAnsi="Arial"/>
           <w:color w:val="231f20"/>
@@ -3396,13 +3427,13 @@
           <w:ilvl w:val="0"/>
           <w:numId w:val="1"/>
         </w:numPr>
-        <w:ind w:left="432" w:hanging="432"/>
-        <w:rPr>
-          <w:rFonts w:ascii="Arial" w:cs="Arial" w:eastAsia="Arial" w:hAnsi="Arial"/>
-          <w:color w:val="231f20"/>
-        </w:rPr>
-      </w:pPr>
-      <w:bookmarkStart w:colFirst="0" w:colLast="0" w:name="_u9s7jm8ner16" w:id="6"/>
+        <w:ind w:left="0" w:right="0" w:firstLine="0"/>
+        <w:rPr>
+          <w:rFonts w:ascii="Arial" w:cs="Arial" w:eastAsia="Arial" w:hAnsi="Arial"/>
+          <w:color w:val="231f20"/>
+        </w:rPr>
+      </w:pPr>
+      <w:bookmarkStart w:colFirst="0" w:colLast="0" w:name="_ircjeoxkn5cs" w:id="6"/>
       <w:bookmarkEnd w:id="6"/>
       <w:r>
         <w:rPr>
@@ -3421,13 +3452,10 @@
           <w:numId w:val="1"/>
         </w:numPr>
         <w:spacing w:before="0" w:lineRule="auto"/>
-        <w:ind w:left="576" w:hanging="576"/>
-        <w:rPr>
-          <w:rFonts w:ascii="Arial" w:cs="Arial" w:eastAsia="Arial" w:hAnsi="Arial"/>
-          <w:color w:val="231f20"/>
-        </w:rPr>
-      </w:pPr>
-      <w:bookmarkStart w:colFirst="0" w:colLast="0" w:name="_gpxfkw8i6ban" w:id="7"/>
+        <w:ind w:left="0" w:right="0" w:firstLine="0"/>
+        <w:rPr/>
+      </w:pPr>
+      <w:bookmarkStart w:colFirst="0" w:colLast="0" w:name="_tlfxyjeuy5kw" w:id="7"/>
       <w:bookmarkEnd w:id="7"/>
       <w:r>
         <w:rPr>
@@ -3440,6 +3468,7 @@
     </w:p>
     <w:p>
       <w:pPr>
+        <w:ind w:left="0" w:right="0" w:firstLine="0"/>
         <w:rPr>
           <w:rFonts w:ascii="Arial" w:cs="Arial" w:eastAsia="Arial" w:hAnsi="Arial"/>
           <w:color w:val="231f20"/>
@@ -3469,13 +3498,10 @@
           <w:numId w:val="1"/>
         </w:numPr>
         <w:spacing w:before="0" w:lineRule="auto"/>
-        <w:ind w:left="576" w:hanging="576"/>
-        <w:rPr>
-          <w:rFonts w:ascii="Arial" w:cs="Arial" w:eastAsia="Arial" w:hAnsi="Arial"/>
-          <w:color w:val="231f20"/>
-        </w:rPr>
-      </w:pPr>
-      <w:bookmarkStart w:colFirst="0" w:colLast="0" w:name="_m3rucwad5806" w:id="8"/>
+        <w:ind w:left="0" w:right="0" w:firstLine="0"/>
+        <w:rPr/>
+      </w:pPr>
+      <w:bookmarkStart w:colFirst="0" w:colLast="0" w:name="_540penvvd74n" w:id="8"/>
       <w:bookmarkEnd w:id="8"/>
       <w:r>
         <w:rPr>
@@ -3493,13 +3519,13 @@
           <w:ilvl w:val="2"/>
           <w:numId w:val="1"/>
         </w:numPr>
-        <w:ind w:left="709" w:hanging="720"/>
-        <w:rPr>
-          <w:rFonts w:ascii="Arial" w:cs="Arial" w:eastAsia="Arial" w:hAnsi="Arial"/>
-          <w:color w:val="231f20"/>
-        </w:rPr>
-      </w:pPr>
-      <w:bookmarkStart w:colFirst="0" w:colLast="0" w:name="_nxw1b59yrd5" w:id="9"/>
+        <w:ind w:left="0" w:right="0" w:firstLine="0"/>
+        <w:rPr>
+          <w:rFonts w:ascii="Arial" w:cs="Arial" w:eastAsia="Arial" w:hAnsi="Arial"/>
+          <w:color w:val="231f20"/>
+        </w:rPr>
+      </w:pPr>
+      <w:bookmarkStart w:colFirst="0" w:colLast="0" w:name="_w55tms3yheid" w:id="9"/>
       <w:bookmarkEnd w:id="9"/>
       <w:r>
         <w:rPr>
@@ -3517,13 +3543,13 @@
           <w:ilvl w:val="3"/>
           <w:numId w:val="1"/>
         </w:numPr>
-        <w:ind w:left="864" w:hanging="864"/>
-        <w:rPr>
-          <w:rFonts w:ascii="Arial" w:cs="Arial" w:eastAsia="Arial" w:hAnsi="Arial"/>
-          <w:color w:val="231f20"/>
-        </w:rPr>
-      </w:pPr>
-      <w:bookmarkStart w:colFirst="0" w:colLast="0" w:name="_cicx3t2dboej" w:id="10"/>
+        <w:ind w:left="0" w:right="0" w:firstLine="0"/>
+        <w:rPr>
+          <w:rFonts w:ascii="Arial" w:cs="Arial" w:eastAsia="Arial" w:hAnsi="Arial"/>
+          <w:color w:val="231f20"/>
+        </w:rPr>
+      </w:pPr>
+      <w:bookmarkStart w:colFirst="0" w:colLast="0" w:name="_drvvmhvgg9ai" w:id="10"/>
       <w:bookmarkEnd w:id="10"/>
       <w:r>
         <w:rPr>
@@ -3537,6 +3563,7 @@
     <w:p>
       <w:pPr>
         <w:spacing w:after="0" w:lineRule="auto"/>
+        <w:ind w:left="0" w:right="0" w:firstLine="0"/>
         <w:rPr>
           <w:rFonts w:ascii="Arial" w:cs="Arial" w:eastAsia="Arial" w:hAnsi="Arial"/>
           <w:color w:val="231f20"/>
@@ -3554,19 +3581,21 @@
     <w:p>
       <w:pPr>
         <w:spacing w:after="0" w:lineRule="auto"/>
-        <w:rPr>
-          <w:rFonts w:ascii="Arial" w:cs="Arial" w:eastAsia="Arial" w:hAnsi="Arial"/>
-          <w:color w:val="231f20"/>
-        </w:rPr>
-      </w:pPr>
-      <w:r>
-        <w:rPr>
-          <w:rtl w:val="0"/>
-        </w:rPr>
-      </w:r>
-    </w:p>
-    <w:p>
-      <w:pPr>
+        <w:ind w:left="0" w:right="0" w:firstLine="0"/>
+        <w:rPr>
+          <w:rFonts w:ascii="Arial" w:cs="Arial" w:eastAsia="Arial" w:hAnsi="Arial"/>
+          <w:color w:val="231f20"/>
+        </w:rPr>
+      </w:pPr>
+      <w:r>
+        <w:rPr>
+          <w:rtl w:val="0"/>
+        </w:rPr>
+      </w:r>
+    </w:p>
+    <w:p>
+      <w:pPr>
+        <w:ind w:left="0" w:right="0" w:firstLine="0"/>
         <w:rPr>
           <w:rFonts w:ascii="Arial" w:cs="Arial" w:eastAsia="Arial" w:hAnsi="Arial"/>
           <w:color w:val="231f20"/>
@@ -3588,13 +3617,13 @@
           <w:ilvl w:val="3"/>
           <w:numId w:val="1"/>
         </w:numPr>
-        <w:ind w:left="864" w:hanging="864"/>
-        <w:rPr>
-          <w:rFonts w:ascii="Arial" w:cs="Arial" w:eastAsia="Arial" w:hAnsi="Arial"/>
-          <w:color w:val="231f20"/>
-        </w:rPr>
-      </w:pPr>
-      <w:bookmarkStart w:colFirst="0" w:colLast="0" w:name="_dckmo69tnedl" w:id="11"/>
+        <w:ind w:left="0" w:right="0" w:firstLine="0"/>
+        <w:rPr>
+          <w:rFonts w:ascii="Arial" w:cs="Arial" w:eastAsia="Arial" w:hAnsi="Arial"/>
+          <w:color w:val="231f20"/>
+        </w:rPr>
+      </w:pPr>
+      <w:bookmarkStart w:colFirst="0" w:colLast="0" w:name="_jbss6p4cl0ev" w:id="11"/>
       <w:bookmarkEnd w:id="11"/>
       <w:r>
         <w:rPr>
@@ -3608,6 +3637,7 @@
     <w:p>
       <w:pPr>
         <w:spacing w:after="0" w:lineRule="auto"/>
+        <w:ind w:left="0" w:right="0" w:firstLine="0"/>
         <w:rPr>
           <w:rFonts w:ascii="Arial" w:cs="Arial" w:eastAsia="Arial" w:hAnsi="Arial"/>
           <w:color w:val="231f20"/>
@@ -3625,6 +3655,7 @@
     <w:p>
       <w:pPr>
         <w:spacing w:after="0" w:lineRule="auto"/>
+        <w:ind w:left="0" w:right="0" w:firstLine="0"/>
         <w:rPr>
           <w:rFonts w:ascii="Arial" w:cs="Arial" w:eastAsia="Arial" w:hAnsi="Arial"/>
           <w:color w:val="231f20"/>
@@ -3642,6 +3673,7 @@
     <w:p>
       <w:pPr>
         <w:spacing w:after="0" w:lineRule="auto"/>
+        <w:ind w:left="0" w:right="0" w:firstLine="0"/>
         <w:rPr>
           <w:rFonts w:ascii="Arial" w:cs="Arial" w:eastAsia="Arial" w:hAnsi="Arial"/>
           <w:color w:val="231f20"/>
@@ -3663,13 +3695,13 @@
           <w:ilvl w:val="3"/>
           <w:numId w:val="1"/>
         </w:numPr>
-        <w:ind w:left="864" w:hanging="864"/>
-        <w:rPr>
-          <w:rFonts w:ascii="Arial" w:cs="Arial" w:eastAsia="Arial" w:hAnsi="Arial"/>
-          <w:color w:val="231f20"/>
-        </w:rPr>
-      </w:pPr>
-      <w:bookmarkStart w:colFirst="0" w:colLast="0" w:name="_ycr2nl3n1xwg" w:id="12"/>
+        <w:ind w:left="0" w:right="0" w:firstLine="0"/>
+        <w:rPr>
+          <w:rFonts w:ascii="Arial" w:cs="Arial" w:eastAsia="Arial" w:hAnsi="Arial"/>
+          <w:color w:val="231f20"/>
+        </w:rPr>
+      </w:pPr>
+      <w:bookmarkStart w:colFirst="0" w:colLast="0" w:name="_dlpq3avidoeq" w:id="12"/>
       <w:bookmarkEnd w:id="12"/>
       <w:r>
         <w:rPr>
@@ -3683,6 +3715,7 @@
     <w:p>
       <w:pPr>
         <w:spacing w:after="0" w:lineRule="auto"/>
+        <w:ind w:left="0" w:right="0" w:firstLine="0"/>
         <w:rPr>
           <w:rFonts w:ascii="Arial" w:cs="Arial" w:eastAsia="Arial" w:hAnsi="Arial"/>
           <w:color w:val="231f20"/>
@@ -3700,19 +3733,21 @@
     <w:p>
       <w:pPr>
         <w:spacing w:after="0" w:lineRule="auto"/>
-        <w:rPr>
-          <w:rFonts w:ascii="Arial" w:cs="Arial" w:eastAsia="Arial" w:hAnsi="Arial"/>
-          <w:color w:val="231f20"/>
-        </w:rPr>
-      </w:pPr>
-      <w:r>
-        <w:rPr>
-          <w:rtl w:val="0"/>
-        </w:rPr>
-      </w:r>
-    </w:p>
-    <w:p>
-      <w:pPr>
+        <w:ind w:left="0" w:right="0" w:firstLine="0"/>
+        <w:rPr>
+          <w:rFonts w:ascii="Arial" w:cs="Arial" w:eastAsia="Arial" w:hAnsi="Arial"/>
+          <w:color w:val="231f20"/>
+        </w:rPr>
+      </w:pPr>
+      <w:r>
+        <w:rPr>
+          <w:rtl w:val="0"/>
+        </w:rPr>
+      </w:r>
+    </w:p>
+    <w:p>
+      <w:pPr>
+        <w:ind w:left="0" w:right="0" w:firstLine="0"/>
         <w:rPr>
           <w:rFonts w:ascii="Arial" w:cs="Arial" w:eastAsia="Arial" w:hAnsi="Arial"/>
           <w:color w:val="231f20"/>
@@ -3736,7 +3771,7 @@
     <w:p>
       <w:pPr>
         <w:spacing w:after="200" w:line="276" w:lineRule="auto"/>
-        <w:ind w:right="0"/>
+        <w:ind w:left="0" w:right="0" w:firstLine="0"/>
         <w:jc w:val="left"/>
         <w:rPr>
           <w:rFonts w:ascii="Arial" w:cs="Arial" w:eastAsia="Arial" w:hAnsi="Arial"/>
@@ -3763,13 +3798,13 @@
           <w:ilvl w:val="3"/>
           <w:numId w:val="1"/>
         </w:numPr>
-        <w:ind w:left="864" w:hanging="864"/>
-        <w:rPr>
-          <w:rFonts w:ascii="Arial" w:cs="Arial" w:eastAsia="Arial" w:hAnsi="Arial"/>
-          <w:color w:val="231f20"/>
-        </w:rPr>
-      </w:pPr>
-      <w:bookmarkStart w:colFirst="0" w:colLast="0" w:name="_37u1482a7bl" w:id="13"/>
+        <w:ind w:left="0" w:right="0" w:firstLine="0"/>
+        <w:rPr>
+          <w:rFonts w:ascii="Arial" w:cs="Arial" w:eastAsia="Arial" w:hAnsi="Arial"/>
+          <w:color w:val="231f20"/>
+        </w:rPr>
+      </w:pPr>
+      <w:bookmarkStart w:colFirst="0" w:colLast="0" w:name="_vd1r9g6axoz4" w:id="13"/>
       <w:bookmarkEnd w:id="13"/>
       <w:r>
         <w:rPr>
@@ -3782,6 +3817,7 @@
     </w:p>
     <w:p>
       <w:pPr>
+        <w:ind w:left="0" w:right="0" w:firstLine="0"/>
         <w:rPr>
           <w:rFonts w:ascii="Arial" w:cs="Arial" w:eastAsia="Arial" w:hAnsi="Arial"/>
           <w:color w:val="231f20"/>
@@ -3798,7 +3834,7 @@
     </w:p>
     <w:p>
       <w:pPr>
-        <w:ind w:firstLine="709"/>
+        <w:ind w:left="0" w:right="0" w:firstLine="0"/>
         <w:rPr>
           <w:rFonts w:ascii="Arial" w:cs="Arial" w:eastAsia="Arial" w:hAnsi="Arial"/>
           <w:color w:val="231f20"/>
@@ -3818,7 +3854,7 @@
     </w:p>
     <w:p>
       <w:pPr>
-        <w:ind w:left="2125" w:hanging="1416"/>
+        <w:ind w:left="0" w:right="0" w:firstLine="0"/>
         <w:rPr>
           <w:rFonts w:ascii="Arial" w:cs="Arial" w:eastAsia="Arial" w:hAnsi="Arial"/>
           <w:color w:val="231f20"/>
@@ -3837,7 +3873,7 @@
     </w:p>
     <w:p>
       <w:pPr>
-        <w:ind w:firstLine="709"/>
+        <w:ind w:left="0" w:right="0" w:firstLine="0"/>
         <w:rPr>
           <w:rFonts w:ascii="Arial" w:cs="Arial" w:eastAsia="Arial" w:hAnsi="Arial"/>
           <w:color w:val="231f20"/>
@@ -3857,6 +3893,7 @@
     </w:p>
     <w:p>
       <w:pPr>
+        <w:ind w:left="0" w:right="0" w:firstLine="0"/>
         <w:jc w:val="center"/>
         <w:rPr>
           <w:rFonts w:ascii="Arial" w:cs="Arial" w:eastAsia="Arial" w:hAnsi="Arial"/>
@@ -3879,13 +3916,13 @@
           <w:ilvl w:val="2"/>
           <w:numId w:val="1"/>
         </w:numPr>
-        <w:ind w:left="709" w:hanging="720"/>
-        <w:rPr>
-          <w:rFonts w:ascii="Arial" w:cs="Arial" w:eastAsia="Arial" w:hAnsi="Arial"/>
-          <w:color w:val="231f20"/>
-        </w:rPr>
-      </w:pPr>
-      <w:bookmarkStart w:colFirst="0" w:colLast="0" w:name="_936ndgecxy8x" w:id="14"/>
+        <w:ind w:left="0" w:right="0" w:firstLine="0"/>
+        <w:rPr>
+          <w:rFonts w:ascii="Arial" w:cs="Arial" w:eastAsia="Arial" w:hAnsi="Arial"/>
+          <w:color w:val="231f20"/>
+        </w:rPr>
+      </w:pPr>
+      <w:bookmarkStart w:colFirst="0" w:colLast="0" w:name="_145oc2dqpux5" w:id="14"/>
       <w:bookmarkEnd w:id="14"/>
       <w:r>
         <w:rPr>
@@ -3903,13 +3940,13 @@
           <w:ilvl w:val="3"/>
           <w:numId w:val="1"/>
         </w:numPr>
-        <w:ind w:left="864" w:hanging="864"/>
-        <w:rPr>
-          <w:rFonts w:ascii="Arial" w:cs="Arial" w:eastAsia="Arial" w:hAnsi="Arial"/>
-          <w:color w:val="231f20"/>
-        </w:rPr>
-      </w:pPr>
-      <w:bookmarkStart w:colFirst="0" w:colLast="0" w:name="_blo82m395dmh" w:id="15"/>
+        <w:ind w:left="0" w:right="0" w:firstLine="0"/>
+        <w:rPr>
+          <w:rFonts w:ascii="Arial" w:cs="Arial" w:eastAsia="Arial" w:hAnsi="Arial"/>
+          <w:color w:val="231f20"/>
+        </w:rPr>
+      </w:pPr>
+      <w:bookmarkStart w:colFirst="0" w:colLast="0" w:name="_mgj1r99crmn5" w:id="15"/>
       <w:bookmarkEnd w:id="15"/>
       <w:r>
         <w:rPr>
@@ -3922,6 +3959,7 @@
     </w:p>
     <w:p>
       <w:pPr>
+        <w:ind w:left="0" w:right="0" w:firstLine="0"/>
         <w:rPr>
           <w:rFonts w:ascii="Arial" w:cs="Arial" w:eastAsia="Arial" w:hAnsi="Arial"/>
           <w:color w:val="231f20"/>
@@ -3943,13 +3981,13 @@
           <w:ilvl w:val="3"/>
           <w:numId w:val="1"/>
         </w:numPr>
-        <w:ind w:left="864" w:hanging="864"/>
-        <w:rPr>
-          <w:rFonts w:ascii="Arial" w:cs="Arial" w:eastAsia="Arial" w:hAnsi="Arial"/>
-          <w:color w:val="231f20"/>
-        </w:rPr>
-      </w:pPr>
-      <w:bookmarkStart w:colFirst="0" w:colLast="0" w:name="_tub5sl6i7g4l" w:id="16"/>
+        <w:ind w:left="0" w:right="0" w:firstLine="0"/>
+        <w:rPr>
+          <w:rFonts w:ascii="Arial" w:cs="Arial" w:eastAsia="Arial" w:hAnsi="Arial"/>
+          <w:color w:val="231f20"/>
+        </w:rPr>
+      </w:pPr>
+      <w:bookmarkStart w:colFirst="0" w:colLast="0" w:name="_tl8rgn4twqn3" w:id="16"/>
       <w:bookmarkEnd w:id="16"/>
       <w:r>
         <w:rPr>
@@ -3962,6 +4000,7 @@
     </w:p>
     <w:p>
       <w:pPr>
+        <w:ind w:left="0" w:right="0" w:firstLine="0"/>
         <w:rPr>
           <w:rFonts w:ascii="Arial" w:cs="Arial" w:eastAsia="Arial" w:hAnsi="Arial"/>
           <w:color w:val="231f20"/>
@@ -3983,13 +4022,13 @@
           <w:ilvl w:val="3"/>
           <w:numId w:val="1"/>
         </w:numPr>
-        <w:ind w:left="864" w:hanging="864"/>
-        <w:rPr>
-          <w:rFonts w:ascii="Arial" w:cs="Arial" w:eastAsia="Arial" w:hAnsi="Arial"/>
-          <w:color w:val="231f20"/>
-        </w:rPr>
-      </w:pPr>
-      <w:bookmarkStart w:colFirst="0" w:colLast="0" w:name="_gltxn8z3fbq5" w:id="17"/>
+        <w:ind w:left="0" w:right="0" w:firstLine="0"/>
+        <w:rPr>
+          <w:rFonts w:ascii="Arial" w:cs="Arial" w:eastAsia="Arial" w:hAnsi="Arial"/>
+          <w:color w:val="231f20"/>
+        </w:rPr>
+      </w:pPr>
+      <w:bookmarkStart w:colFirst="0" w:colLast="0" w:name="_kdwlycg4k7e1" w:id="17"/>
       <w:bookmarkEnd w:id="17"/>
       <w:r>
         <w:rPr>
@@ -4002,6 +4041,7 @@
     </w:p>
     <w:p>
       <w:pPr>
+        <w:ind w:left="0" w:right="0" w:firstLine="0"/>
         <w:jc w:val="center"/>
         <w:rPr>
           <w:rFonts w:ascii="Arial" w:cs="Arial" w:eastAsia="Arial" w:hAnsi="Arial"/>
@@ -4024,13 +4064,10 @@
           <w:ilvl w:val="1"/>
           <w:numId w:val="1"/>
         </w:numPr>
-        <w:ind w:left="576" w:hanging="576"/>
-        <w:rPr>
-          <w:rFonts w:ascii="Arial" w:cs="Arial" w:eastAsia="Arial" w:hAnsi="Arial"/>
-          <w:color w:val="231f20"/>
-        </w:rPr>
-      </w:pPr>
-      <w:bookmarkStart w:colFirst="0" w:colLast="0" w:name="_5pvxsc3jvbpl" w:id="18"/>
+        <w:ind w:left="0" w:right="0" w:firstLine="0"/>
+        <w:rPr/>
+      </w:pPr>
+      <w:bookmarkStart w:colFirst="0" w:colLast="0" w:name="_b3i82938a1tx" w:id="18"/>
       <w:bookmarkEnd w:id="18"/>
       <w:r>
         <w:rPr>
@@ -4044,6 +4081,7 @@
     <w:p>
       <w:pPr>
         <w:spacing w:before="240" w:lineRule="auto"/>
+        <w:ind w:left="0" w:right="0" w:firstLine="0"/>
         <w:rPr>
           <w:rFonts w:ascii="Arial" w:cs="Arial" w:eastAsia="Arial" w:hAnsi="Arial"/>
           <w:color w:val="231f20"/>
@@ -4068,6 +4106,7 @@
     <w:p>
       <w:pPr>
         <w:spacing w:after="0" w:lineRule="auto"/>
+        <w:ind w:left="0" w:right="0" w:firstLine="0"/>
         <w:rPr>
           <w:rFonts w:ascii="Arial" w:cs="Arial" w:eastAsia="Arial" w:hAnsi="Arial"/>
           <w:color w:val="231f20"/>
@@ -4085,19 +4124,21 @@
     <w:p>
       <w:pPr>
         <w:spacing w:after="0" w:lineRule="auto"/>
-        <w:rPr>
-          <w:rFonts w:ascii="Arial" w:cs="Arial" w:eastAsia="Arial" w:hAnsi="Arial"/>
-          <w:color w:val="231f20"/>
-        </w:rPr>
-      </w:pPr>
-      <w:r>
-        <w:rPr>
-          <w:rtl w:val="0"/>
-        </w:rPr>
-      </w:r>
-    </w:p>
-    <w:p>
-      <w:pPr>
+        <w:ind w:left="0" w:right="0" w:firstLine="0"/>
+        <w:rPr>
+          <w:rFonts w:ascii="Arial" w:cs="Arial" w:eastAsia="Arial" w:hAnsi="Arial"/>
+          <w:color w:val="231f20"/>
+        </w:rPr>
+      </w:pPr>
+      <w:r>
+        <w:rPr>
+          <w:rtl w:val="0"/>
+        </w:rPr>
+      </w:r>
+    </w:p>
+    <w:p>
+      <w:pPr>
+        <w:ind w:left="0" w:right="0" w:firstLine="0"/>
         <w:rPr>
           <w:rFonts w:ascii="Arial" w:cs="Arial" w:eastAsia="Arial" w:hAnsi="Arial"/>
           <w:color w:val="231f20"/>
@@ -4114,6 +4155,7 @@
     </w:p>
     <w:p>
       <w:pPr>
+        <w:ind w:left="0" w:right="0" w:firstLine="0"/>
         <w:rPr>
           <w:rFonts w:ascii="Arial" w:cs="Arial" w:eastAsia="Arial" w:hAnsi="Arial"/>
           <w:color w:val="231f20"/>
@@ -4131,12 +4173,13 @@
     <w:p>
       <w:pPr>
         <w:pStyle w:val="Heading1"/>
-        <w:rPr>
-          <w:rFonts w:ascii="Arial" w:cs="Arial" w:eastAsia="Arial" w:hAnsi="Arial"/>
-          <w:color w:val="231f20"/>
-        </w:rPr>
-      </w:pPr>
-      <w:bookmarkStart w:colFirst="0" w:colLast="0" w:name="_uvfiez9lf0km" w:id="19"/>
+        <w:ind w:left="0" w:right="0" w:firstLine="0"/>
+        <w:rPr>
+          <w:rFonts w:ascii="Arial" w:cs="Arial" w:eastAsia="Arial" w:hAnsi="Arial"/>
+          <w:color w:val="231f20"/>
+        </w:rPr>
+      </w:pPr>
+      <w:bookmarkStart w:colFirst="0" w:colLast="0" w:name="_r5bayxr2zy5b" w:id="19"/>
       <w:bookmarkEnd w:id="19"/>
       <w:r>
         <w:rPr>
@@ -4149,6 +4192,7 @@
     </w:p>
     <w:p>
       <w:pPr>
+        <w:ind w:left="0" w:right="0" w:firstLine="0"/>
         <w:jc w:val="left"/>
         <w:rPr>
           <w:rFonts w:ascii="Arial" w:cs="Arial" w:eastAsia="Arial" w:hAnsi="Arial"/>
@@ -4166,6 +4210,7 @@
     </w:p>
     <w:p>
       <w:pPr>
+        <w:ind w:left="0" w:right="0" w:firstLine="0"/>
         <w:jc w:val="left"/>
         <w:rPr>
           <w:rFonts w:ascii="Arial" w:cs="Arial" w:eastAsia="Arial" w:hAnsi="Arial"/>
@@ -4184,12 +4229,13 @@
     <w:p>
       <w:pPr>
         <w:pStyle w:val="Heading1"/>
-        <w:rPr>
-          <w:rFonts w:ascii="Arial" w:cs="Arial" w:eastAsia="Arial" w:hAnsi="Arial"/>
-          <w:color w:val="231f20"/>
-        </w:rPr>
-      </w:pPr>
-      <w:bookmarkStart w:colFirst="0" w:colLast="0" w:name="_crcf0yyrh6dm" w:id="20"/>
+        <w:ind w:left="0" w:right="0" w:firstLine="0"/>
+        <w:rPr>
+          <w:rFonts w:ascii="Arial" w:cs="Arial" w:eastAsia="Arial" w:hAnsi="Arial"/>
+          <w:color w:val="231f20"/>
+        </w:rPr>
+      </w:pPr>
+      <w:bookmarkStart w:colFirst="0" w:colLast="0" w:name="_4fl30xiojlow" w:id="20"/>
       <w:bookmarkEnd w:id="20"/>
       <w:r>
         <w:rPr>
@@ -4202,6 +4248,7 @@
     </w:p>
     <w:p>
       <w:pPr>
+        <w:ind w:left="0" w:right="0" w:firstLine="0"/>
         <w:rPr>
           <w:rFonts w:ascii="Arial" w:cs="Arial" w:eastAsia="Arial" w:hAnsi="Arial"/>
           <w:color w:val="231f20"/>
@@ -4218,6 +4265,7 @@
     </w:p>
     <w:p>
       <w:pPr>
+        <w:ind w:left="0" w:right="0" w:firstLine="0"/>
         <w:rPr>
           <w:rFonts w:ascii="Arial" w:cs="Arial" w:eastAsia="Arial" w:hAnsi="Arial"/>
           <w:color w:val="231f20"/>
@@ -4235,12 +4283,13 @@
     <w:p>
       <w:pPr>
         <w:pStyle w:val="Heading1"/>
-        <w:rPr>
-          <w:rFonts w:ascii="Arial" w:cs="Arial" w:eastAsia="Arial" w:hAnsi="Arial"/>
-          <w:color w:val="231f20"/>
-        </w:rPr>
-      </w:pPr>
-      <w:bookmarkStart w:colFirst="0" w:colLast="0" w:name="_rh9pwd9vdfvg" w:id="21"/>
+        <w:ind w:left="0" w:right="0" w:firstLine="0"/>
+        <w:rPr>
+          <w:rFonts w:ascii="Arial" w:cs="Arial" w:eastAsia="Arial" w:hAnsi="Arial"/>
+          <w:color w:val="231f20"/>
+        </w:rPr>
+      </w:pPr>
+      <w:bookmarkStart w:colFirst="0" w:colLast="0" w:name="_awssxfqq7ejp" w:id="21"/>
       <w:bookmarkEnd w:id="21"/>
       <w:r>
         <w:rPr>
@@ -4253,6 +4302,7 @@
     </w:p>
     <w:p>
       <w:pPr>
+        <w:ind w:left="0" w:right="0" w:firstLine="0"/>
         <w:rPr>
           <w:rFonts w:ascii="Arial" w:cs="Arial" w:eastAsia="Arial" w:hAnsi="Arial"/>
           <w:color w:val="231f20"/>
@@ -4271,7 +4321,7 @@
       <w:headerReference r:id="rId7" w:type="default"/>
       <w:footerReference r:id="rId8" w:type="default"/>
       <w:pgSz w:h="16838" w:w="11906" w:orient="portrait"/>
-      <w:pgMar w:bottom="245" w:top="1440" w:left="432" w:right="1138" w:header="562" w:footer="562"/>
+      <w:pgMar w:bottom="1133.8582677165355" w:top="1133.8582677165355" w:left="850.3937007874016" w:right="850.3937007874016" w:header="562" w:footer="562"/>
       <w:pgNumType w:start="1"/>
       <w:titlePg w:val="1"/>
     </w:sectPr>
@@ -4285,7 +4335,6 @@
     <w:pPr>
       <w:keepNext w:val="0"/>
       <w:keepLines w:val="0"/>
-      <w:pageBreakBefore w:val="0"/>
       <w:widowControl w:val="0"/>
       <w:pBdr>
         <w:top w:space="0" w:sz="0" w:val="nil"/>
@@ -4324,7 +4373,6 @@
     <w:pPr>
       <w:keepNext w:val="0"/>
       <w:keepLines w:val="0"/>
-      <w:pageBreakBefore w:val="0"/>
       <w:widowControl w:val="0"/>
       <w:pBdr>
         <w:top w:color="808080" w:space="0" w:sz="4" w:val="single"/>
@@ -4335,7 +4383,7 @@
       </w:pBdr>
       <w:shd w:fill="auto" w:val="clear"/>
       <w:spacing w:after="0" w:before="0" w:line="240" w:lineRule="auto"/>
-      <w:ind w:left="-142" w:right="0" w:firstLine="0"/>
+      <w:ind w:left="0" w:right="0" w:firstLine="0"/>
       <w:jc w:val="center"/>
       <w:rPr>
         <w:rFonts w:ascii="Tahoma" w:cs="Tahoma" w:eastAsia="Tahoma" w:hAnsi="Tahoma"/>
@@ -4455,10 +4503,10 @@
         <wp:anchor allowOverlap="1" behindDoc="0" distB="0" distT="0" distL="0" distR="0" hidden="0" layoutInCell="1" locked="0" relativeHeight="0" simplePos="0">
           <wp:simplePos x="0" y="0"/>
           <wp:positionH relativeFrom="column">
-            <wp:posOffset>-67309</wp:posOffset>
+            <wp:posOffset>295275</wp:posOffset>
           </wp:positionH>
           <wp:positionV relativeFrom="paragraph">
-            <wp:posOffset>106680</wp:posOffset>
+            <wp:posOffset>104775</wp:posOffset>
           </wp:positionV>
           <wp:extent cx="962941" cy="363600"/>
           <wp:effectExtent b="0" l="0" r="0" t="0"/>
@@ -4502,7 +4550,6 @@
     <w:pPr>
       <w:keepNext w:val="0"/>
       <w:keepLines w:val="0"/>
-      <w:pageBreakBefore w:val="0"/>
       <w:widowControl w:val="0"/>
       <w:pBdr>
         <w:top w:space="0" w:sz="0" w:val="nil"/>
@@ -4527,15 +4574,15 @@
         <wp:anchor allowOverlap="1" behindDoc="0" distB="0" distT="0" distL="114300" distR="114300" hidden="0" layoutInCell="1" locked="0" relativeHeight="0" simplePos="0">
           <wp:simplePos x="0" y="0"/>
           <wp:positionH relativeFrom="column">
-            <wp:posOffset>95251</wp:posOffset>
+            <wp:posOffset>95252</wp:posOffset>
           </wp:positionH>
           <wp:positionV relativeFrom="paragraph">
-            <wp:posOffset>-73568</wp:posOffset>
+            <wp:posOffset>-73567</wp:posOffset>
           </wp:positionV>
           <wp:extent cx="1355753" cy="1011600"/>
           <wp:effectExtent b="0" l="0" r="0" t="0"/>
           <wp:wrapNone/>
-          <wp:docPr id="1" name="image2.png"/>
+          <wp:docPr id="3" name="image2.png"/>
           <a:graphic>
             <a:graphicData uri="http://schemas.openxmlformats.org/drawingml/2006/picture">
               <pic:pic>
@@ -4568,7 +4615,7 @@
   <w:tbl>
     <w:tblPr>
       <w:tblStyle w:val="Table1"/>
-      <w:tblW w:w="9810.0" w:type="dxa"/>
+      <w:tblW w:w="10200.0" w:type="dxa"/>
       <w:jc w:val="left"/>
       <w:tblBorders>
         <w:bottom w:color="000000" w:space="0" w:sz="4" w:val="single"/>
@@ -4579,12 +4626,12 @@
     <w:tblGrid>
       <w:gridCol w:w="3510"/>
       <w:gridCol w:w="3240"/>
-      <w:gridCol w:w="3060"/>
+      <w:gridCol w:w="3450"/>
       <w:tblGridChange w:id="0">
         <w:tblGrid>
           <w:gridCol w:w="3510"/>
           <w:gridCol w:w="3240"/>
-          <w:gridCol w:w="3060"/>
+          <w:gridCol w:w="3450"/>
         </w:tblGrid>
       </w:tblGridChange>
     </w:tblGrid>
@@ -5059,7 +5106,6 @@
     <w:pPr>
       <w:keepNext w:val="0"/>
       <w:keepLines w:val="0"/>
-      <w:pageBreakBefore w:val="0"/>
       <w:widowControl w:val="1"/>
       <w:pBdr>
         <w:top w:space="0" w:sz="0" w:val="nil"/>

</xml_diff>

<commit_message>
fix (PT theme): removal of the Monarc logo from the footer of the DOCX templates.
</commit_message>
<xml_diff>
--- a/deliveries/cases/EN/1.docx
+++ b/deliveries/cases/EN/1.docx
@@ -32,12 +32,12 @@
             <wp:extent cx="1880235" cy="1381716"/>
             <wp:effectExtent b="0" l="0" r="0" t="0"/>
             <wp:wrapSquare wrapText="bothSides" distB="0" distT="0" distL="114300" distR="114300"/>
-            <wp:docPr id="1" name="image2.png"/>
+            <wp:docPr id="1" name="image1.png"/>
             <a:graphic>
               <a:graphicData uri="http://schemas.openxmlformats.org/drawingml/2006/picture">
                 <pic:pic>
                   <pic:nvPicPr>
-                    <pic:cNvPr id="0" name="image2.png"/>
+                    <pic:cNvPr id="0" name="image1.png"/>
                     <pic:cNvPicPr preferRelativeResize="0"/>
                   </pic:nvPicPr>
                   <pic:blipFill>
@@ -224,7 +224,7 @@
           <w:color w:val="231f20"/>
         </w:rPr>
       </w:pPr>
-      <w:bookmarkStart w:colFirst="0" w:colLast="0" w:name="_23432owwd8l" w:id="0"/>
+      <w:bookmarkStart w:colFirst="0" w:colLast="0" w:name="_ng0qgv1n4se9" w:id="0"/>
       <w:bookmarkEnd w:id="0"/>
       <w:r>
         <w:rPr>
@@ -891,7 +891,7 @@
     </w:p>
     <w:sdt>
       <w:sdtPr>
-        <w:id w:val="1152581063"/>
+        <w:id w:val="-1559749884"/>
         <w:docPartObj>
           <w:docPartGallery w:val="Table of Contents"/>
           <w:docPartUnique w:val="1"/>
@@ -938,7 +938,7 @@
             <w:instrText xml:space="preserve"> TOC \h \u \z \t "Heading 1,1,Heading 2,2,Heading 3,3,"</w:instrText>
             <w:fldChar w:fldCharType="separate"/>
           </w:r>
-          <w:hyperlink w:anchor="_31ipnx3mb6gq">
+          <w:hyperlink w:anchor="_h8pfx74d9cnr">
             <w:r>
               <w:rPr>
                 <w:rFonts w:ascii="Arial" w:cs="Arial" w:eastAsia="Arial" w:hAnsi="Arial"/>
@@ -959,7 +959,7 @@
               <w:t xml:space="preserve">1</w:t>
             </w:r>
           </w:hyperlink>
-          <w:hyperlink w:anchor="_31ipnx3mb6gq">
+          <w:hyperlink w:anchor="_h8pfx74d9cnr">
             <w:r>
               <w:rPr>
                 <w:rFonts w:ascii="Arial" w:cs="Arial" w:eastAsia="Arial" w:hAnsi="Arial"/>
@@ -980,7 +980,7 @@
           </w:hyperlink>
           <w:r>
             <w:fldChar w:fldCharType="begin"/>
-            <w:instrText xml:space="preserve"> PAGEREF _31ipnx3mb6gq \h </w:instrText>
+            <w:instrText xml:space="preserve"> PAGEREF _h8pfx74d9cnr \h </w:instrText>
             <w:fldChar w:fldCharType="separate"/>
           </w:r>
           <w:r>
@@ -1048,7 +1048,7 @@
               <w:vertAlign w:val="baseline"/>
             </w:rPr>
           </w:pPr>
-          <w:hyperlink w:anchor="_qt606yhoff7b">
+          <w:hyperlink w:anchor="_nzmbyzi9ch82">
             <w:r>
               <w:rPr>
                 <w:rFonts w:ascii="Arial" w:cs="Arial" w:eastAsia="Arial" w:hAnsi="Arial"/>
@@ -1067,7 +1067,7 @@
               <w:t xml:space="preserve">1.1</w:t>
             </w:r>
           </w:hyperlink>
-          <w:hyperlink w:anchor="_qt606yhoff7b">
+          <w:hyperlink w:anchor="_nzmbyzi9ch82">
             <w:r>
               <w:rPr>
                 <w:rFonts w:ascii="Arial" w:cs="Arial" w:eastAsia="Arial" w:hAnsi="Arial"/>
@@ -1088,7 +1088,7 @@
           </w:hyperlink>
           <w:r>
             <w:fldChar w:fldCharType="begin"/>
-            <w:instrText xml:space="preserve"> PAGEREF _qt606yhoff7b \h </w:instrText>
+            <w:instrText xml:space="preserve"> PAGEREF _nzmbyzi9ch82 \h </w:instrText>
             <w:fldChar w:fldCharType="separate"/>
           </w:r>
           <w:r>
@@ -1154,7 +1154,7 @@
               <w:vertAlign w:val="baseline"/>
             </w:rPr>
           </w:pPr>
-          <w:hyperlink w:anchor="_8bezkteulqn6">
+          <w:hyperlink w:anchor="_1ilo1n621o8e">
             <w:r>
               <w:rPr>
                 <w:rFonts w:ascii="Arial" w:cs="Arial" w:eastAsia="Arial" w:hAnsi="Arial"/>
@@ -1173,7 +1173,7 @@
               <w:t xml:space="preserve">1.2</w:t>
             </w:r>
           </w:hyperlink>
-          <w:hyperlink w:anchor="_8bezkteulqn6">
+          <w:hyperlink w:anchor="_1ilo1n621o8e">
             <w:r>
               <w:rPr>
                 <w:rFonts w:ascii="Arial" w:cs="Arial" w:eastAsia="Arial" w:hAnsi="Arial"/>
@@ -1194,7 +1194,7 @@
           </w:hyperlink>
           <w:r>
             <w:fldChar w:fldCharType="begin"/>
-            <w:instrText xml:space="preserve"> PAGEREF _8bezkteulqn6 \h </w:instrText>
+            <w:instrText xml:space="preserve"> PAGEREF _1ilo1n621o8e \h </w:instrText>
             <w:fldChar w:fldCharType="separate"/>
           </w:r>
           <w:r>
@@ -1260,7 +1260,7 @@
               <w:vertAlign w:val="baseline"/>
             </w:rPr>
           </w:pPr>
-          <w:hyperlink w:anchor="_eo3tjujxxnrv">
+          <w:hyperlink w:anchor="_wy0opy5jcnce">
             <w:r>
               <w:rPr>
                 <w:rFonts w:ascii="Arial" w:cs="Arial" w:eastAsia="Arial" w:hAnsi="Arial"/>
@@ -1279,7 +1279,7 @@
               <w:t xml:space="preserve">1.3</w:t>
             </w:r>
           </w:hyperlink>
-          <w:hyperlink w:anchor="_eo3tjujxxnrv">
+          <w:hyperlink w:anchor="_wy0opy5jcnce">
             <w:r>
               <w:rPr>
                 <w:rFonts w:ascii="Arial" w:cs="Arial" w:eastAsia="Arial" w:hAnsi="Arial"/>
@@ -1300,7 +1300,7 @@
           </w:hyperlink>
           <w:r>
             <w:fldChar w:fldCharType="begin"/>
-            <w:instrText xml:space="preserve"> PAGEREF _eo3tjujxxnrv \h </w:instrText>
+            <w:instrText xml:space="preserve"> PAGEREF _wy0opy5jcnce \h </w:instrText>
             <w:fldChar w:fldCharType="separate"/>
           </w:r>
           <w:r>
@@ -1366,7 +1366,7 @@
               <w:vertAlign w:val="baseline"/>
             </w:rPr>
           </w:pPr>
-          <w:hyperlink w:anchor="_ircjeoxkn5cs">
+          <w:hyperlink w:anchor="_13x3svl04y3u">
             <w:r>
               <w:rPr>
                 <w:rFonts w:ascii="Arial" w:cs="Arial" w:eastAsia="Arial" w:hAnsi="Arial"/>
@@ -1387,7 +1387,7 @@
               <w:t xml:space="preserve">2</w:t>
             </w:r>
           </w:hyperlink>
-          <w:hyperlink w:anchor="_ircjeoxkn5cs">
+          <w:hyperlink w:anchor="_13x3svl04y3u">
             <w:r>
               <w:rPr>
                 <w:rFonts w:ascii="Arial" w:cs="Arial" w:eastAsia="Arial" w:hAnsi="Arial"/>
@@ -1408,7 +1408,7 @@
           </w:hyperlink>
           <w:r>
             <w:fldChar w:fldCharType="begin"/>
-            <w:instrText xml:space="preserve"> PAGEREF _ircjeoxkn5cs \h </w:instrText>
+            <w:instrText xml:space="preserve"> PAGEREF _13x3svl04y3u \h </w:instrText>
             <w:fldChar w:fldCharType="separate"/>
           </w:r>
           <w:r>
@@ -1476,7 +1476,7 @@
               <w:vertAlign w:val="baseline"/>
             </w:rPr>
           </w:pPr>
-          <w:hyperlink w:anchor="_tlfxyjeuy5kw">
+          <w:hyperlink w:anchor="_j2plw2p98u4t">
             <w:r>
               <w:rPr>
                 <w:rFonts w:ascii="Arial" w:cs="Arial" w:eastAsia="Arial" w:hAnsi="Arial"/>
@@ -1495,7 +1495,7 @@
               <w:t xml:space="preserve">2.1</w:t>
             </w:r>
           </w:hyperlink>
-          <w:hyperlink w:anchor="_tlfxyjeuy5kw">
+          <w:hyperlink w:anchor="_j2plw2p98u4t">
             <w:r>
               <w:rPr>
                 <w:rFonts w:ascii="Arial" w:cs="Arial" w:eastAsia="Arial" w:hAnsi="Arial"/>
@@ -1516,7 +1516,7 @@
           </w:hyperlink>
           <w:r>
             <w:fldChar w:fldCharType="begin"/>
-            <w:instrText xml:space="preserve"> PAGEREF _tlfxyjeuy5kw \h </w:instrText>
+            <w:instrText xml:space="preserve"> PAGEREF _j2plw2p98u4t \h </w:instrText>
             <w:fldChar w:fldCharType="separate"/>
           </w:r>
           <w:r>
@@ -1582,7 +1582,7 @@
               <w:vertAlign w:val="baseline"/>
             </w:rPr>
           </w:pPr>
-          <w:hyperlink w:anchor="_540penvvd74n">
+          <w:hyperlink w:anchor="_ti6e1wsovt7j">
             <w:r>
               <w:rPr>
                 <w:rFonts w:ascii="Arial" w:cs="Arial" w:eastAsia="Arial" w:hAnsi="Arial"/>
@@ -1601,7 +1601,7 @@
               <w:t xml:space="preserve">2.2</w:t>
             </w:r>
           </w:hyperlink>
-          <w:hyperlink w:anchor="_540penvvd74n">
+          <w:hyperlink w:anchor="_ti6e1wsovt7j">
             <w:r>
               <w:rPr>
                 <w:rFonts w:ascii="Arial" w:cs="Arial" w:eastAsia="Arial" w:hAnsi="Arial"/>
@@ -1622,7 +1622,7 @@
           </w:hyperlink>
           <w:r>
             <w:fldChar w:fldCharType="begin"/>
-            <w:instrText xml:space="preserve"> PAGEREF _540penvvd74n \h </w:instrText>
+            <w:instrText xml:space="preserve"> PAGEREF _ti6e1wsovt7j \h </w:instrText>
             <w:fldChar w:fldCharType="separate"/>
           </w:r>
           <w:r>
@@ -1688,7 +1688,7 @@
               <w:vertAlign w:val="baseline"/>
             </w:rPr>
           </w:pPr>
-          <w:hyperlink w:anchor="_w55tms3yheid">
+          <w:hyperlink w:anchor="_al8r607rph3p">
             <w:r>
               <w:rPr>
                 <w:rFonts w:ascii="Arial" w:cs="Arial" w:eastAsia="Arial" w:hAnsi="Arial"/>
@@ -1707,7 +1707,7 @@
               <w:t xml:space="preserve">2.2.1</w:t>
             </w:r>
           </w:hyperlink>
-          <w:hyperlink w:anchor="_w55tms3yheid">
+          <w:hyperlink w:anchor="_al8r607rph3p">
             <w:r>
               <w:rPr>
                 <w:rFonts w:ascii="Arial" w:cs="Arial" w:eastAsia="Arial" w:hAnsi="Arial"/>
@@ -1728,7 +1728,7 @@
           </w:hyperlink>
           <w:r>
             <w:fldChar w:fldCharType="begin"/>
-            <w:instrText xml:space="preserve"> PAGEREF _w55tms3yheid \h </w:instrText>
+            <w:instrText xml:space="preserve"> PAGEREF _al8r607rph3p \h </w:instrText>
             <w:fldChar w:fldCharType="separate"/>
           </w:r>
           <w:r>
@@ -1794,7 +1794,7 @@
               <w:vertAlign w:val="baseline"/>
             </w:rPr>
           </w:pPr>
-          <w:hyperlink w:anchor="_drvvmhvgg9ai">
+          <w:hyperlink w:anchor="_njoon36we3zo">
             <w:r>
               <w:rPr>
                 <w:rFonts w:ascii="Arial" w:cs="Arial" w:eastAsia="Arial" w:hAnsi="Arial"/>
@@ -1813,7 +1813,7 @@
               <w:t xml:space="preserve">2.2.1.1</w:t>
             </w:r>
           </w:hyperlink>
-          <w:hyperlink w:anchor="_drvvmhvgg9ai">
+          <w:hyperlink w:anchor="_njoon36we3zo">
             <w:r>
               <w:rPr>
                 <w:rFonts w:ascii="Arial" w:cs="Arial" w:eastAsia="Arial" w:hAnsi="Arial"/>
@@ -1834,7 +1834,7 @@
           </w:hyperlink>
           <w:r>
             <w:fldChar w:fldCharType="begin"/>
-            <w:instrText xml:space="preserve"> PAGEREF _drvvmhvgg9ai \h </w:instrText>
+            <w:instrText xml:space="preserve"> PAGEREF _njoon36we3zo \h </w:instrText>
             <w:fldChar w:fldCharType="separate"/>
           </w:r>
           <w:r>
@@ -1900,7 +1900,7 @@
               <w:vertAlign w:val="baseline"/>
             </w:rPr>
           </w:pPr>
-          <w:hyperlink w:anchor="_jbss6p4cl0ev">
+          <w:hyperlink w:anchor="_em67x9qinpfc">
             <w:r>
               <w:rPr>
                 <w:rFonts w:ascii="Arial" w:cs="Arial" w:eastAsia="Arial" w:hAnsi="Arial"/>
@@ -1919,7 +1919,7 @@
               <w:t xml:space="preserve">2.2.1.2</w:t>
             </w:r>
           </w:hyperlink>
-          <w:hyperlink w:anchor="_jbss6p4cl0ev">
+          <w:hyperlink w:anchor="_em67x9qinpfc">
             <w:r>
               <w:rPr>
                 <w:rFonts w:ascii="Arial" w:cs="Arial" w:eastAsia="Arial" w:hAnsi="Arial"/>
@@ -1940,7 +1940,7 @@
           </w:hyperlink>
           <w:r>
             <w:fldChar w:fldCharType="begin"/>
-            <w:instrText xml:space="preserve"> PAGEREF _jbss6p4cl0ev \h </w:instrText>
+            <w:instrText xml:space="preserve"> PAGEREF _em67x9qinpfc \h </w:instrText>
             <w:fldChar w:fldCharType="separate"/>
           </w:r>
           <w:r>
@@ -2006,7 +2006,7 @@
               <w:vertAlign w:val="baseline"/>
             </w:rPr>
           </w:pPr>
-          <w:hyperlink w:anchor="_dlpq3avidoeq">
+          <w:hyperlink w:anchor="_mzifftaxqjml">
             <w:r>
               <w:rPr>
                 <w:rFonts w:ascii="Arial" w:cs="Arial" w:eastAsia="Arial" w:hAnsi="Arial"/>
@@ -2025,7 +2025,7 @@
               <w:t xml:space="preserve">2.2.1.3</w:t>
             </w:r>
           </w:hyperlink>
-          <w:hyperlink w:anchor="_dlpq3avidoeq">
+          <w:hyperlink w:anchor="_mzifftaxqjml">
             <w:r>
               <w:rPr>
                 <w:rFonts w:ascii="Arial" w:cs="Arial" w:eastAsia="Arial" w:hAnsi="Arial"/>
@@ -2046,7 +2046,7 @@
           </w:hyperlink>
           <w:r>
             <w:fldChar w:fldCharType="begin"/>
-            <w:instrText xml:space="preserve"> PAGEREF _dlpq3avidoeq \h </w:instrText>
+            <w:instrText xml:space="preserve"> PAGEREF _mzifftaxqjml \h </w:instrText>
             <w:fldChar w:fldCharType="separate"/>
           </w:r>
           <w:r>
@@ -2112,7 +2112,7 @@
               <w:vertAlign w:val="baseline"/>
             </w:rPr>
           </w:pPr>
-          <w:hyperlink w:anchor="_vd1r9g6axoz4">
+          <w:hyperlink w:anchor="_7aq4ft5iv5i">
             <w:r>
               <w:rPr>
                 <w:rFonts w:ascii="Arial" w:cs="Arial" w:eastAsia="Arial" w:hAnsi="Arial"/>
@@ -2131,7 +2131,7 @@
               <w:t xml:space="preserve">2.2.1.4</w:t>
             </w:r>
           </w:hyperlink>
-          <w:hyperlink w:anchor="_vd1r9g6axoz4">
+          <w:hyperlink w:anchor="_7aq4ft5iv5i">
             <w:r>
               <w:rPr>
                 <w:rFonts w:ascii="Arial" w:cs="Arial" w:eastAsia="Arial" w:hAnsi="Arial"/>
@@ -2152,7 +2152,7 @@
           </w:hyperlink>
           <w:r>
             <w:fldChar w:fldCharType="begin"/>
-            <w:instrText xml:space="preserve"> PAGEREF _vd1r9g6axoz4 \h </w:instrText>
+            <w:instrText xml:space="preserve"> PAGEREF _7aq4ft5iv5i \h </w:instrText>
             <w:fldChar w:fldCharType="separate"/>
           </w:r>
           <w:r>
@@ -2218,7 +2218,7 @@
               <w:vertAlign w:val="baseline"/>
             </w:rPr>
           </w:pPr>
-          <w:hyperlink w:anchor="_145oc2dqpux5">
+          <w:hyperlink w:anchor="_ahdii5dingqq">
             <w:r>
               <w:rPr>
                 <w:rFonts w:ascii="Arial" w:cs="Arial" w:eastAsia="Arial" w:hAnsi="Arial"/>
@@ -2237,7 +2237,7 @@
               <w:t xml:space="preserve">2.2.2</w:t>
             </w:r>
           </w:hyperlink>
-          <w:hyperlink w:anchor="_145oc2dqpux5">
+          <w:hyperlink w:anchor="_ahdii5dingqq">
             <w:r>
               <w:rPr>
                 <w:rFonts w:ascii="Arial" w:cs="Arial" w:eastAsia="Arial" w:hAnsi="Arial"/>
@@ -2258,7 +2258,7 @@
           </w:hyperlink>
           <w:r>
             <w:fldChar w:fldCharType="begin"/>
-            <w:instrText xml:space="preserve"> PAGEREF _145oc2dqpux5 \h </w:instrText>
+            <w:instrText xml:space="preserve"> PAGEREF _ahdii5dingqq \h </w:instrText>
             <w:fldChar w:fldCharType="separate"/>
           </w:r>
           <w:r>
@@ -2324,7 +2324,7 @@
               <w:vertAlign w:val="baseline"/>
             </w:rPr>
           </w:pPr>
-          <w:hyperlink w:anchor="_mgj1r99crmn5">
+          <w:hyperlink w:anchor="_90rcqf6y2xxf">
             <w:r>
               <w:rPr>
                 <w:rFonts w:ascii="Arial" w:cs="Arial" w:eastAsia="Arial" w:hAnsi="Arial"/>
@@ -2343,7 +2343,7 @@
               <w:t xml:space="preserve">2.2.2.1</w:t>
             </w:r>
           </w:hyperlink>
-          <w:hyperlink w:anchor="_mgj1r99crmn5">
+          <w:hyperlink w:anchor="_90rcqf6y2xxf">
             <w:r>
               <w:rPr>
                 <w:rFonts w:ascii="Arial" w:cs="Arial" w:eastAsia="Arial" w:hAnsi="Arial"/>
@@ -2364,7 +2364,7 @@
           </w:hyperlink>
           <w:r>
             <w:fldChar w:fldCharType="begin"/>
-            <w:instrText xml:space="preserve"> PAGEREF _mgj1r99crmn5 \h </w:instrText>
+            <w:instrText xml:space="preserve"> PAGEREF _90rcqf6y2xxf \h </w:instrText>
             <w:fldChar w:fldCharType="separate"/>
           </w:r>
           <w:r>
@@ -2430,7 +2430,7 @@
               <w:vertAlign w:val="baseline"/>
             </w:rPr>
           </w:pPr>
-          <w:hyperlink w:anchor="_tl8rgn4twqn3">
+          <w:hyperlink w:anchor="_53b0vtaogpjy">
             <w:r>
               <w:rPr>
                 <w:rFonts w:ascii="Arial" w:cs="Arial" w:eastAsia="Arial" w:hAnsi="Arial"/>
@@ -2449,7 +2449,7 @@
               <w:t xml:space="preserve">2.2.2.2</w:t>
             </w:r>
           </w:hyperlink>
-          <w:hyperlink w:anchor="_tl8rgn4twqn3">
+          <w:hyperlink w:anchor="_53b0vtaogpjy">
             <w:r>
               <w:rPr>
                 <w:rFonts w:ascii="Arial" w:cs="Arial" w:eastAsia="Arial" w:hAnsi="Arial"/>
@@ -2470,7 +2470,7 @@
           </w:hyperlink>
           <w:r>
             <w:fldChar w:fldCharType="begin"/>
-            <w:instrText xml:space="preserve"> PAGEREF _tl8rgn4twqn3 \h </w:instrText>
+            <w:instrText xml:space="preserve"> PAGEREF _53b0vtaogpjy \h </w:instrText>
             <w:fldChar w:fldCharType="separate"/>
           </w:r>
           <w:r>
@@ -2536,7 +2536,7 @@
               <w:vertAlign w:val="baseline"/>
             </w:rPr>
           </w:pPr>
-          <w:hyperlink w:anchor="_kdwlycg4k7e1">
+          <w:hyperlink w:anchor="_worq1u1tf1jv">
             <w:r>
               <w:rPr>
                 <w:rFonts w:ascii="Arial" w:cs="Arial" w:eastAsia="Arial" w:hAnsi="Arial"/>
@@ -2555,7 +2555,7 @@
               <w:t xml:space="preserve">2.2.2.3</w:t>
             </w:r>
           </w:hyperlink>
-          <w:hyperlink w:anchor="_kdwlycg4k7e1">
+          <w:hyperlink w:anchor="_worq1u1tf1jv">
             <w:r>
               <w:rPr>
                 <w:rFonts w:ascii="Arial" w:cs="Arial" w:eastAsia="Arial" w:hAnsi="Arial"/>
@@ -2576,7 +2576,7 @@
           </w:hyperlink>
           <w:r>
             <w:fldChar w:fldCharType="begin"/>
-            <w:instrText xml:space="preserve"> PAGEREF _kdwlycg4k7e1 \h </w:instrText>
+            <w:instrText xml:space="preserve"> PAGEREF _worq1u1tf1jv \h </w:instrText>
             <w:fldChar w:fldCharType="separate"/>
           </w:r>
           <w:r>
@@ -2642,7 +2642,7 @@
               <w:vertAlign w:val="baseline"/>
             </w:rPr>
           </w:pPr>
-          <w:hyperlink w:anchor="_b3i82938a1tx">
+          <w:hyperlink w:anchor="_13uvjvqq5iq9">
             <w:r>
               <w:rPr>
                 <w:rFonts w:ascii="Arial" w:cs="Arial" w:eastAsia="Arial" w:hAnsi="Arial"/>
@@ -2661,7 +2661,7 @@
               <w:t xml:space="preserve">2.3</w:t>
             </w:r>
           </w:hyperlink>
-          <w:hyperlink w:anchor="_b3i82938a1tx">
+          <w:hyperlink w:anchor="_13uvjvqq5iq9">
             <w:r>
               <w:rPr>
                 <w:rFonts w:ascii="Arial" w:cs="Arial" w:eastAsia="Arial" w:hAnsi="Arial"/>
@@ -2682,7 +2682,7 @@
           </w:hyperlink>
           <w:r>
             <w:fldChar w:fldCharType="begin"/>
-            <w:instrText xml:space="preserve"> PAGEREF _b3i82938a1tx \h </w:instrText>
+            <w:instrText xml:space="preserve"> PAGEREF _13uvjvqq5iq9 \h </w:instrText>
             <w:fldChar w:fldCharType="separate"/>
           </w:r>
           <w:r>
@@ -2747,7 +2747,7 @@
               <w:vertAlign w:val="baseline"/>
             </w:rPr>
           </w:pPr>
-          <w:hyperlink w:anchor="_r5bayxr2zy5b">
+          <w:hyperlink w:anchor="_o6ceuzpgtgnm">
             <w:r>
               <w:rPr>
                 <w:rFonts w:ascii="Arial" w:cs="Arial" w:eastAsia="Arial" w:hAnsi="Arial"/>
@@ -2810,7 +2810,7 @@
               <w:vertAlign w:val="baseline"/>
             </w:rPr>
           </w:pPr>
-          <w:hyperlink w:anchor="_4fl30xiojlow">
+          <w:hyperlink w:anchor="_zfsy1n8kz5m8">
             <w:r>
               <w:rPr>
                 <w:rFonts w:ascii="Arial" w:cs="Arial" w:eastAsia="Arial" w:hAnsi="Arial"/>
@@ -2873,7 +2873,7 @@
               <w:vertAlign w:val="baseline"/>
             </w:rPr>
           </w:pPr>
-          <w:hyperlink w:anchor="_awssxfqq7ejp">
+          <w:hyperlink w:anchor="_8c1bs0wr9dmp">
             <w:r>
               <w:rPr>
                 <w:rFonts w:ascii="Arial" w:cs="Arial" w:eastAsia="Arial" w:hAnsi="Arial"/>
@@ -3154,7 +3154,7 @@
           <w:color w:val="231f20"/>
         </w:rPr>
       </w:pPr>
-      <w:bookmarkStart w:colFirst="0" w:colLast="0" w:name="_z13rq0l31cuj" w:id="1"/>
+      <w:bookmarkStart w:colFirst="0" w:colLast="0" w:name="_z4xwtldgl7q5" w:id="1"/>
       <w:bookmarkEnd w:id="1"/>
       <w:r>
         <w:br w:type="page"/>
@@ -3178,7 +3178,7 @@
           <w:color w:val="231f20"/>
         </w:rPr>
       </w:pPr>
-      <w:bookmarkStart w:colFirst="0" w:colLast="0" w:name="_31ipnx3mb6gq" w:id="2"/>
+      <w:bookmarkStart w:colFirst="0" w:colLast="0" w:name="_h8pfx74d9cnr" w:id="2"/>
       <w:bookmarkEnd w:id="2"/>
       <w:r>
         <w:rPr>
@@ -3199,7 +3199,7 @@
         <w:ind w:left="0" w:right="0" w:firstLine="0"/>
         <w:rPr/>
       </w:pPr>
-      <w:bookmarkStart w:colFirst="0" w:colLast="0" w:name="_qt606yhoff7b" w:id="3"/>
+      <w:bookmarkStart w:colFirst="0" w:colLast="0" w:name="_nzmbyzi9ch82" w:id="3"/>
       <w:bookmarkEnd w:id="3"/>
       <w:r>
         <w:rPr>
@@ -3208,6 +3208,11 @@
           <w:rtl w:val="0"/>
         </w:rPr>
         <w:t xml:space="preserve">Placing the risk analysis in context</w:t>
+      </w:r>
+      <w:r>
+        <w:rPr>
+          <w:rtl w:val="0"/>
+        </w:rPr>
       </w:r>
     </w:p>
     <w:p>
@@ -3246,7 +3251,7 @@
         <w:ind w:left="0" w:right="0" w:firstLine="0"/>
         <w:rPr/>
       </w:pPr>
-      <w:bookmarkStart w:colFirst="0" w:colLast="0" w:name="_8bezkteulqn6" w:id="4"/>
+      <w:bookmarkStart w:colFirst="0" w:colLast="0" w:name="_1ilo1n621o8e" w:id="4"/>
       <w:bookmarkEnd w:id="4"/>
       <w:r>
         <w:rPr>
@@ -3255,6 +3260,11 @@
           <w:rtl w:val="0"/>
         </w:rPr>
         <w:t xml:space="preserve">Aims of the document</w:t>
+      </w:r>
+      <w:r>
+        <w:rPr>
+          <w:rtl w:val="0"/>
+        </w:rPr>
       </w:r>
     </w:p>
     <w:p>
@@ -3301,7 +3311,7 @@
         <w:ind w:left="0" w:right="0" w:firstLine="0"/>
         <w:rPr/>
       </w:pPr>
-      <w:bookmarkStart w:colFirst="0" w:colLast="0" w:name="_eo3tjujxxnrv" w:id="5"/>
+      <w:bookmarkStart w:colFirst="0" w:colLast="0" w:name="_wy0opy5jcnce" w:id="5"/>
       <w:bookmarkEnd w:id="5"/>
       <w:r>
         <w:rPr>
@@ -3310,6 +3320,11 @@
           <w:rtl w:val="0"/>
         </w:rPr>
         <w:t xml:space="preserve">Acronyms/Glossary</w:t>
+      </w:r>
+      <w:r>
+        <w:rPr>
+          <w:rtl w:val="0"/>
+        </w:rPr>
       </w:r>
     </w:p>
     <w:p>
@@ -3433,7 +3448,7 @@
           <w:color w:val="231f20"/>
         </w:rPr>
       </w:pPr>
-      <w:bookmarkStart w:colFirst="0" w:colLast="0" w:name="_ircjeoxkn5cs" w:id="6"/>
+      <w:bookmarkStart w:colFirst="0" w:colLast="0" w:name="_13x3svl04y3u" w:id="6"/>
       <w:bookmarkEnd w:id="6"/>
       <w:r>
         <w:rPr>
@@ -3455,7 +3470,7 @@
         <w:ind w:left="0" w:right="0" w:firstLine="0"/>
         <w:rPr/>
       </w:pPr>
-      <w:bookmarkStart w:colFirst="0" w:colLast="0" w:name="_tlfxyjeuy5kw" w:id="7"/>
+      <w:bookmarkStart w:colFirst="0" w:colLast="0" w:name="_j2plw2p98u4t" w:id="7"/>
       <w:bookmarkEnd w:id="7"/>
       <w:r>
         <w:rPr>
@@ -3464,6 +3479,11 @@
           <w:rtl w:val="0"/>
         </w:rPr>
         <w:t xml:space="preserve">Description of the context</w:t>
+      </w:r>
+      <w:r>
+        <w:rPr>
+          <w:rtl w:val="0"/>
+        </w:rPr>
       </w:r>
     </w:p>
     <w:p>
@@ -3501,7 +3521,7 @@
         <w:ind w:left="0" w:right="0" w:firstLine="0"/>
         <w:rPr/>
       </w:pPr>
-      <w:bookmarkStart w:colFirst="0" w:colLast="0" w:name="_540penvvd74n" w:id="8"/>
+      <w:bookmarkStart w:colFirst="0" w:colLast="0" w:name="_ti6e1wsovt7j" w:id="8"/>
       <w:bookmarkEnd w:id="8"/>
       <w:r>
         <w:rPr>
@@ -3510,6 +3530,11 @@
           <w:rtl w:val="0"/>
         </w:rPr>
         <w:t xml:space="preserve">Definition of the risk evaluation criteria</w:t>
+      </w:r>
+      <w:r>
+        <w:rPr>
+          <w:rtl w:val="0"/>
+        </w:rPr>
       </w:r>
     </w:p>
     <w:p>
@@ -3525,7 +3550,7 @@
           <w:color w:val="231f20"/>
         </w:rPr>
       </w:pPr>
-      <w:bookmarkStart w:colFirst="0" w:colLast="0" w:name="_w55tms3yheid" w:id="9"/>
+      <w:bookmarkStart w:colFirst="0" w:colLast="0" w:name="_al8r607rph3p" w:id="9"/>
       <w:bookmarkEnd w:id="9"/>
       <w:r>
         <w:rPr>
@@ -3549,7 +3574,7 @@
           <w:color w:val="231f20"/>
         </w:rPr>
       </w:pPr>
-      <w:bookmarkStart w:colFirst="0" w:colLast="0" w:name="_drvvmhvgg9ai" w:id="10"/>
+      <w:bookmarkStart w:colFirst="0" w:colLast="0" w:name="_njoon36we3zo" w:id="10"/>
       <w:bookmarkEnd w:id="10"/>
       <w:r>
         <w:rPr>
@@ -3623,7 +3648,7 @@
           <w:color w:val="231f20"/>
         </w:rPr>
       </w:pPr>
-      <w:bookmarkStart w:colFirst="0" w:colLast="0" w:name="_jbss6p4cl0ev" w:id="11"/>
+      <w:bookmarkStart w:colFirst="0" w:colLast="0" w:name="_em67x9qinpfc" w:id="11"/>
       <w:bookmarkEnd w:id="11"/>
       <w:r>
         <w:rPr>
@@ -3701,7 +3726,7 @@
           <w:color w:val="231f20"/>
         </w:rPr>
       </w:pPr>
-      <w:bookmarkStart w:colFirst="0" w:colLast="0" w:name="_dlpq3avidoeq" w:id="12"/>
+      <w:bookmarkStart w:colFirst="0" w:colLast="0" w:name="_mzifftaxqjml" w:id="12"/>
       <w:bookmarkEnd w:id="12"/>
       <w:r>
         <w:rPr>
@@ -3804,7 +3829,7 @@
           <w:color w:val="231f20"/>
         </w:rPr>
       </w:pPr>
-      <w:bookmarkStart w:colFirst="0" w:colLast="0" w:name="_vd1r9g6axoz4" w:id="13"/>
+      <w:bookmarkStart w:colFirst="0" w:colLast="0" w:name="_7aq4ft5iv5i" w:id="13"/>
       <w:bookmarkEnd w:id="13"/>
       <w:r>
         <w:rPr>
@@ -3922,7 +3947,7 @@
           <w:color w:val="231f20"/>
         </w:rPr>
       </w:pPr>
-      <w:bookmarkStart w:colFirst="0" w:colLast="0" w:name="_145oc2dqpux5" w:id="14"/>
+      <w:bookmarkStart w:colFirst="0" w:colLast="0" w:name="_ahdii5dingqq" w:id="14"/>
       <w:bookmarkEnd w:id="14"/>
       <w:r>
         <w:rPr>
@@ -3946,7 +3971,7 @@
           <w:color w:val="231f20"/>
         </w:rPr>
       </w:pPr>
-      <w:bookmarkStart w:colFirst="0" w:colLast="0" w:name="_mgj1r99crmn5" w:id="15"/>
+      <w:bookmarkStart w:colFirst="0" w:colLast="0" w:name="_90rcqf6y2xxf" w:id="15"/>
       <w:bookmarkEnd w:id="15"/>
       <w:r>
         <w:rPr>
@@ -3987,7 +4012,7 @@
           <w:color w:val="231f20"/>
         </w:rPr>
       </w:pPr>
-      <w:bookmarkStart w:colFirst="0" w:colLast="0" w:name="_tl8rgn4twqn3" w:id="16"/>
+      <w:bookmarkStart w:colFirst="0" w:colLast="0" w:name="_53b0vtaogpjy" w:id="16"/>
       <w:bookmarkEnd w:id="16"/>
       <w:r>
         <w:rPr>
@@ -4028,7 +4053,7 @@
           <w:color w:val="231f20"/>
         </w:rPr>
       </w:pPr>
-      <w:bookmarkStart w:colFirst="0" w:colLast="0" w:name="_kdwlycg4k7e1" w:id="17"/>
+      <w:bookmarkStart w:colFirst="0" w:colLast="0" w:name="_worq1u1tf1jv" w:id="17"/>
       <w:bookmarkEnd w:id="17"/>
       <w:r>
         <w:rPr>
@@ -4067,7 +4092,7 @@
         <w:ind w:left="0" w:right="0" w:firstLine="0"/>
         <w:rPr/>
       </w:pPr>
-      <w:bookmarkStart w:colFirst="0" w:colLast="0" w:name="_b3i82938a1tx" w:id="18"/>
+      <w:bookmarkStart w:colFirst="0" w:colLast="0" w:name="_13uvjvqq5iq9" w:id="18"/>
       <w:bookmarkEnd w:id="18"/>
       <w:r>
         <w:rPr>
@@ -4076,6 +4101,11 @@
           <w:rtl w:val="0"/>
         </w:rPr>
         <w:t xml:space="preserve">Evaluation of trends and threats</w:t>
+      </w:r>
+      <w:r>
+        <w:rPr>
+          <w:rtl w:val="0"/>
+        </w:rPr>
       </w:r>
     </w:p>
     <w:p>
@@ -4179,7 +4209,7 @@
           <w:color w:val="231f20"/>
         </w:rPr>
       </w:pPr>
-      <w:bookmarkStart w:colFirst="0" w:colLast="0" w:name="_r5bayxr2zy5b" w:id="19"/>
+      <w:bookmarkStart w:colFirst="0" w:colLast="0" w:name="_o6ceuzpgtgnm" w:id="19"/>
       <w:bookmarkEnd w:id="19"/>
       <w:r>
         <w:rPr>
@@ -4235,7 +4265,7 @@
           <w:color w:val="231f20"/>
         </w:rPr>
       </w:pPr>
-      <w:bookmarkStart w:colFirst="0" w:colLast="0" w:name="_4fl30xiojlow" w:id="20"/>
+      <w:bookmarkStart w:colFirst="0" w:colLast="0" w:name="_zfsy1n8kz5m8" w:id="20"/>
       <w:bookmarkEnd w:id="20"/>
       <w:r>
         <w:rPr>
@@ -4289,7 +4319,7 @@
           <w:color w:val="231f20"/>
         </w:rPr>
       </w:pPr>
-      <w:bookmarkStart w:colFirst="0" w:colLast="0" w:name="_awssxfqq7ejp" w:id="21"/>
+      <w:bookmarkStart w:colFirst="0" w:colLast="0" w:name="_8c1bs0wr9dmp" w:id="21"/>
       <w:bookmarkEnd w:id="21"/>
       <w:r>
         <w:rPr>
@@ -4384,7 +4414,7 @@
       <w:shd w:fill="auto" w:val="clear"/>
       <w:spacing w:after="0" w:before="0" w:line="240" w:lineRule="auto"/>
       <w:ind w:left="0" w:right="0" w:firstLine="0"/>
-      <w:jc w:val="center"/>
+      <w:jc w:val="right"/>
       <w:rPr>
         <w:rFonts w:ascii="Tahoma" w:cs="Tahoma" w:eastAsia="Tahoma" w:hAnsi="Tahoma"/>
         <w:b w:val="0"/>
@@ -4498,48 +4528,6 @@
         <w:rtl w:val="0"/>
       </w:rPr>
     </w:r>
-    <w:r>
-      <w:drawing>
-        <wp:anchor allowOverlap="1" behindDoc="0" distB="0" distT="0" distL="0" distR="0" hidden="0" layoutInCell="1" locked="0" relativeHeight="0" simplePos="0">
-          <wp:simplePos x="0" y="0"/>
-          <wp:positionH relativeFrom="column">
-            <wp:posOffset>295275</wp:posOffset>
-          </wp:positionH>
-          <wp:positionV relativeFrom="paragraph">
-            <wp:posOffset>104775</wp:posOffset>
-          </wp:positionV>
-          <wp:extent cx="962941" cy="363600"/>
-          <wp:effectExtent b="0" l="0" r="0" t="0"/>
-          <wp:wrapNone/>
-          <wp:docPr id="2" name="image1.png"/>
-          <a:graphic>
-            <a:graphicData uri="http://schemas.openxmlformats.org/drawingml/2006/picture">
-              <pic:pic>
-                <pic:nvPicPr>
-                  <pic:cNvPr id="0" name="image1.png"/>
-                  <pic:cNvPicPr preferRelativeResize="0"/>
-                </pic:nvPicPr>
-                <pic:blipFill>
-                  <a:blip r:embed="rId1"/>
-                  <a:srcRect b="0" l="0" r="0" t="0"/>
-                  <a:stretch>
-                    <a:fillRect/>
-                  </a:stretch>
-                </pic:blipFill>
-                <pic:spPr>
-                  <a:xfrm>
-                    <a:off x="0" y="0"/>
-                    <a:ext cx="962941" cy="363600"/>
-                  </a:xfrm>
-                  <a:prstGeom prst="rect"/>
-                  <a:ln/>
-                </pic:spPr>
-              </pic:pic>
-            </a:graphicData>
-          </a:graphic>
-        </wp:anchor>
-      </w:drawing>
-    </w:r>
   </w:p>
 </w:ftr>
 </file>
@@ -4574,20 +4562,20 @@
         <wp:anchor allowOverlap="1" behindDoc="0" distB="0" distT="0" distL="114300" distR="114300" hidden="0" layoutInCell="1" locked="0" relativeHeight="0" simplePos="0">
           <wp:simplePos x="0" y="0"/>
           <wp:positionH relativeFrom="column">
-            <wp:posOffset>95252</wp:posOffset>
+            <wp:posOffset>95253</wp:posOffset>
           </wp:positionH>
           <wp:positionV relativeFrom="paragraph">
-            <wp:posOffset>-73567</wp:posOffset>
+            <wp:posOffset>-73566</wp:posOffset>
           </wp:positionV>
           <wp:extent cx="1355753" cy="1011600"/>
           <wp:effectExtent b="0" l="0" r="0" t="0"/>
           <wp:wrapNone/>
-          <wp:docPr id="3" name="image2.png"/>
+          <wp:docPr id="2" name="image1.png"/>
           <a:graphic>
             <a:graphicData uri="http://schemas.openxmlformats.org/drawingml/2006/picture">
               <pic:pic>
                 <pic:nvPicPr>
-                  <pic:cNvPr id="0" name="image2.png"/>
+                  <pic:cNvPr id="0" name="image1.png"/>
                   <pic:cNvPicPr preferRelativeResize="0"/>
                 </pic:nvPicPr>
                 <pic:blipFill>

</xml_diff>